<commit_message>
Sync local changes — updated dashboard, cleanup output files
Co-Authored-By: Claude Opus 4.6 <noreply@anthropic.com>
</commit_message>
<xml_diff>
--- a/white_paper.docx
+++ b/white_paper.docx
@@ -4,249 +4,13 @@
   <w:body>
     <w:p>
       <w:pPr>
-        <w:spacing w:after="0"/>
-      </w:pPr>
-    </w:p>
-    <w:p>
-      <w:pPr>
-        <w:spacing w:after="0"/>
-      </w:pPr>
-    </w:p>
-    <w:p>
-      <w:pPr>
-        <w:spacing w:after="0"/>
-      </w:pPr>
-    </w:p>
-    <w:p>
-      <w:pPr>
-        <w:spacing w:after="80"/>
-        <w:jc w:val="center"/>
-      </w:pPr>
-      <w:r>
-        <w:rPr>
-          <w:rFonts w:ascii="Georgia" w:hAnsi="Georgia"/>
-          <w:b/>
-          <w:color w:val="1B2A4A"/>
-          <w:sz w:val="48"/>
-        </w:rPr>
-        <w:t>Regime-Conditional Credit Factor Rotation</w:t>
-      </w:r>
-    </w:p>
-    <w:p>
-      <w:pPr>
-        <w:spacing w:after="280"/>
-        <w:jc w:val="center"/>
-      </w:pPr>
-      <w:r>
-        <w:rPr>
-          <w:rFonts w:ascii="Georgia" w:hAnsi="Georgia"/>
-          <w:color w:val="3D5A80"/>
-          <w:sz w:val="32"/>
-        </w:rPr>
-        <w:t>A Bayesian Framework for Investment-Grade Rating-Tier Allocation</w:t>
-      </w:r>
-    </w:p>
-    <w:p>
-      <w:pPr>
-        <w:spacing w:after="240"/>
-        <w:jc w:val="center"/>
-      </w:pPr>
-      <w:r>
-        <w:rPr>
-          <w:color w:val="1B2A4A"/>
-          <w:sz w:val="16"/>
-        </w:rPr>
-        <w:t>━━━━━━━━━━━━━━━━━━━━━━━━━━━━━━</w:t>
-      </w:r>
-    </w:p>
-    <w:p>
-      <w:pPr>
-        <w:spacing w:after="40"/>
-        <w:jc w:val="center"/>
-      </w:pPr>
-      <w:r>
-        <w:rPr>
-          <w:rFonts w:ascii="Arial" w:hAnsi="Arial"/>
-          <w:b/>
-          <w:color w:val="3C3C3C"/>
-          <w:sz w:val="26"/>
-        </w:rPr>
-        <w:t>Michael Tabet, CFA</w:t>
-      </w:r>
-    </w:p>
-    <w:p>
-      <w:pPr>
-        <w:spacing w:after="320"/>
-        <w:jc w:val="center"/>
-      </w:pPr>
-      <w:r>
-        <w:rPr>
-          <w:rFonts w:ascii="Arial" w:hAnsi="Arial"/>
-          <w:i/>
-          <w:color w:val="3C3C3C"/>
-          <w:sz w:val="20"/>
-        </w:rPr>
-        <w:t>Working Paper  |  March 2026</w:t>
-      </w:r>
-    </w:p>
-    <w:p>
-      <w:pPr>
-        <w:pBdr>
-          <w:top w:val="single" w:sz="6" w:space="4" w:color="1B2A4A"/>
-          <w:bottom w:val="single" w:sz="6" w:space="4" w:color="1B2A4A"/>
-          <w:left w:val="single" w:sz="6" w:space="8" w:color="1B2A4A"/>
-          <w:right w:val="single" w:sz="6" w:space="8" w:color="1B2A4A"/>
-        </w:pBdr>
-        <w:shd w:fill="F5F5F5" w:val="clear"/>
-        <w:spacing w:before="120" w:after="120" w:line="276" w:lineRule="auto"/>
-        <w:ind w:left="216" w:right="216"/>
-        <w:jc w:val="both"/>
-      </w:pPr>
-      <w:r>
-        <w:rPr>
-          <w:rFonts w:ascii="Arial" w:hAnsi="Arial"/>
-          <w:b/>
-          <w:color w:val="1B2A4A"/>
-          <w:sz w:val="22"/>
-        </w:rPr>
-        <w:t>Abstract</w:t>
-        <w:br/>
-      </w:r>
-      <w:r>
-        <w:rPr>
-          <w:rFonts w:ascii="Arial" w:hAnsi="Arial"/>
-          <w:color w:val="3C3C3C"/>
-          <w:sz w:val="20"/>
-        </w:rPr>
-        <w:t>This paper tests whether systematic rotation across investment-grade rating tiers (AAA, AA, A, BBB) generates excess returns over a market-cap-weighted benchmark when conditioned on credit market regimes. A three-layer Bayesian pipeline combines Hidden Markov Model regime detection, Prophet-based spread forecasting, and Black-Litterman portfolio construction with credit factor signals (DTS, value, momentum). The framework uses only publicly available FRED OAS data and is fully replicable. Backtested over 25+ years of monthly data with stress testing and Monte Carlo simulation.</w:t>
-      </w:r>
-    </w:p>
-    <w:p>
-      <w:pPr>
-        <w:spacing w:after="40"/>
-        <w:ind w:left="216"/>
-      </w:pPr>
-      <w:r>
-        <w:rPr>
-          <w:rFonts w:ascii="Arial" w:hAnsi="Arial"/>
-          <w:b/>
-          <w:color w:val="1B2A4A"/>
-          <w:sz w:val="18"/>
-        </w:rPr>
-        <w:t xml:space="preserve">Keywords: </w:t>
-      </w:r>
-      <w:r>
-        <w:rPr>
-          <w:rFonts w:ascii="Arial" w:hAnsi="Arial"/>
-          <w:color w:val="3C3C3C"/>
-          <w:sz w:val="18"/>
-        </w:rPr>
-        <w:t>credit factors, regime switching, Black-Litterman, HMM, investment-grade bonds, OAS, portfolio construction</w:t>
-      </w:r>
-      <w:r>
-        <w:rPr>
-          <w:rFonts w:ascii="Arial" w:hAnsi="Arial"/>
-          <w:b/>
-          <w:color w:val="1B2A4A"/>
-          <w:sz w:val="18"/>
-        </w:rPr>
-        <w:t xml:space="preserve">   |   JEL: </w:t>
-      </w:r>
-      <w:r>
-        <w:rPr>
-          <w:rFonts w:ascii="Arial" w:hAnsi="Arial"/>
-          <w:color w:val="3C3C3C"/>
-          <w:sz w:val="18"/>
-        </w:rPr>
-        <w:t>G11, G12, C58</w:t>
-      </w:r>
-    </w:p>
-    <w:p>
-      <w:pPr>
-        <w:pBdr>
-          <w:top w:val="single" w:sz="6" w:space="4" w:color="3D5A80"/>
-          <w:bottom w:val="single" w:sz="6" w:space="4" w:color="3D5A80"/>
-          <w:left w:val="single" w:sz="6" w:space="8" w:color="3D5A80"/>
-          <w:right w:val="single" w:sz="6" w:space="8" w:color="3D5A80"/>
-        </w:pBdr>
-        <w:shd w:fill="FAFAFA" w:val="clear"/>
-        <w:spacing w:before="120" w:after="120" w:line="276" w:lineRule="auto"/>
-        <w:ind w:left="216" w:right="216"/>
-        <w:jc w:val="both"/>
-      </w:pPr>
-      <w:r>
-        <w:rPr>
-          <w:rFonts w:ascii="Arial" w:hAnsi="Arial"/>
-          <w:b/>
-          <w:color w:val="1B2A4A"/>
-          <w:sz w:val="20"/>
-        </w:rPr>
-        <w:t>About the Author</w:t>
-        <w:br/>
-      </w:r>
-      <w:r>
-        <w:rPr>
-          <w:rFonts w:ascii="Arial" w:hAnsi="Arial"/>
-          <w:color w:val="3C3C3C"/>
-          <w:sz w:val="18"/>
-        </w:rPr>
-        <w:t>Michael Tabet, CFA is a quantitative finance professional advising and managing capital for five family offices. He previously worked in multi-asset investment solutions for a Canadian asset owner, structuring allocation frameworks for institutional clients including pension funds and sovereign-adjacent entities. He began his career as a trader in Beirut. Michael holds the CFA Charter, an MBA, and an MSc in Econometrics from Saint Joseph University, with thesis research on rule-based investment strategies.</w:t>
-      </w:r>
-    </w:p>
-    <w:p>
-      <w:r>
-        <w:br w:type="page"/>
-      </w:r>
-    </w:p>
-    <w:p>
-      <w:pPr>
-        <w:spacing w:after="40"/>
-      </w:pPr>
-      <w:r>
-        <w:rPr>
-          <w:rFonts w:ascii="Arial" w:hAnsi="Arial"/>
-          <w:b/>
-          <w:color w:val="1B2A4A"/>
-          <w:sz w:val="28"/>
-        </w:rPr>
-        <w:t>EXECUTIVE SUMMARY</w:t>
-      </w:r>
-    </w:p>
-    <w:p>
-      <w:pPr>
-        <w:spacing w:after="160"/>
-      </w:pPr>
-      <w:r>
-        <w:rPr>
-          <w:color w:val="1B2A4A"/>
-          <w:sz w:val="16"/>
-        </w:rPr>
-        <w:t>━━━━━━━━━━━━━━━━━━━━━━━━━━━━━━━━━━━━━━━━</w:t>
-      </w:r>
-    </w:p>
-    <w:p>
-      <w:pPr>
-        <w:spacing w:after="160" w:line="288" w:lineRule="auto"/>
-      </w:pPr>
-      <w:r>
-        <w:rPr>
-          <w:rFonts w:ascii="Arial" w:hAnsi="Arial"/>
-          <w:b/>
-          <w:color w:val="3C3C3C"/>
-          <w:sz w:val="20"/>
-        </w:rPr>
-        <w:t>The regime-conditional factor rotation strategy improves risk-adjusted returns relative to a passive IG benchmark. The Sharpe ratio increases, maximum drawdown decreases, and the primary source of value is defensive positioning during stress episodes.</w:t>
-      </w:r>
-    </w:p>
-    <w:p>
-      <w:pPr>
-        <w:spacing w:before="80"/>
+        <w:spacing w:before="0" w:after="0"/>
         <w:jc w:val="center"/>
       </w:pPr>
       <w:r>
         <w:drawing>
           <wp:inline xmlns:a="http://schemas.openxmlformats.org/drawingml/2006/main" xmlns:pic="http://schemas.openxmlformats.org/drawingml/2006/picture">
-            <wp:extent cx="5486400" cy="3352800"/>
+            <wp:extent cx="6858000" cy="8875059"/>
             <wp:docPr id="1" name="Picture 1"/>
             <wp:cNvGraphicFramePr>
               <a:graphicFrameLocks noChangeAspect="1"/>
@@ -255,7 +19,7 @@
               <a:graphicData uri="http://schemas.openxmlformats.org/drawingml/2006/picture">
                 <pic:pic>
                   <pic:nvPicPr>
-                    <pic:cNvPr id="0" name="exec_fig_26.png"/>
+                    <pic:cNvPr id="0" name="cover_page.png"/>
                     <pic:cNvPicPr/>
                   </pic:nvPicPr>
                   <pic:blipFill>
@@ -267,7 +31,7 @@
                   <pic:spPr>
                     <a:xfrm>
                       <a:off x="0" y="0"/>
-                      <a:ext cx="5486400" cy="3352800"/>
+                      <a:ext cx="6858000" cy="8875059"/>
                     </a:xfrm>
                     <a:prstGeom prst="rect"/>
                   </pic:spPr>
@@ -279,8 +43,67 @@
       </w:r>
     </w:p>
     <w:p>
-      <w:pPr>
-        <w:spacing w:before="40" w:after="160" w:line="276" w:lineRule="auto"/>
+      <w:r>
+        <w:br w:type="page"/>
+      </w:r>
+    </w:p>
+    <w:p>
+      <w:pPr>
+        <w:spacing w:after="40"/>
+      </w:pPr>
+      <w:r>
+        <w:rPr>
+          <w:rFonts w:ascii="Arial" w:hAnsi="Arial"/>
+          <w:b/>
+          <w:color w:val="1B2A4A"/>
+          <w:sz w:val="28"/>
+        </w:rPr>
+        <w:t>EXECUTIVE SUMMARY</w:t>
+      </w:r>
+    </w:p>
+    <w:p>
+      <w:pPr>
+        <w:spacing w:after="160"/>
+      </w:pPr>
+      <w:r>
+        <w:rPr>
+          <w:color w:val="1B2A4A"/>
+          <w:sz w:val="16"/>
+        </w:rPr>
+        <w:t>━━━━━━━━━━━━━━━━━━━━━━━━━━━━━━━━━━━━━━━━</w:t>
+      </w:r>
+    </w:p>
+    <w:p>
+      <w:pPr>
+        <w:spacing w:after="120" w:line="288" w:lineRule="auto"/>
+      </w:pPr>
+      <w:r>
+        <w:rPr>
+          <w:rFonts w:ascii="Arial" w:hAnsi="Arial"/>
+          <w:b/>
+          <w:color w:val="3C3C3C"/>
+          <w:sz w:val="20"/>
+        </w:rPr>
+        <w:t>The regime-conditional factor rotation strategy delivers superior risk-adjusted returns relative to a passive IG benchmark. The Sharpe ratio increases, maximum drawdown decreases, and outperformance concentrates during stress episodes where the regime model shifts to defensive positioning.</w:t>
+      </w:r>
+    </w:p>
+    <w:p>
+      <w:pPr>
+        <w:spacing w:before="240" w:after="60" w:line="264" w:lineRule="auto"/>
+      </w:pPr>
+      <w:r>
+        <w:rPr>
+          <w:rFonts w:ascii="Arial" w:hAnsi="Arial"/>
+          <w:b/>
+          <w:color w:val="1B2A4A"/>
+          <w:sz w:val="20"/>
+        </w:rPr>
+        <w:t>The factor strategy outperforms the benchmark on a risk-adjusted basis</w:t>
+      </w:r>
+    </w:p>
+    <w:p>
+      <w:pPr>
+        <w:spacing w:before="0" w:after="80" w:line="276" w:lineRule="auto"/>
         <w:jc w:val="left"/>
       </w:pPr>
       <w:r>
@@ -289,12 +112,12 @@
           <w:color w:val="3C3C3C"/>
           <w:sz w:val="18"/>
         </w:rPr>
-        <w:t>Cumulative return comparison over the full backtest period. The factor strategy (navy) outperforms the passive benchmark on a risk-adjusted basis, with visible outperformance during stress episodes where the regime model shifts to defensive positioning.</w:t>
+        <w:t>Cumulative return comparison over the full backtest period. Outperformance concentrates during stress episodes where the regime model shifts to defensive positioning.</w:t>
       </w:r>
     </w:p>
     <w:p>
       <w:pPr>
-        <w:spacing w:before="80"/>
+        <w:spacing w:before="40" w:after="200"/>
         <w:jc w:val="center"/>
       </w:pPr>
       <w:r>
@@ -309,7 +132,7 @@
               <a:graphicData uri="http://schemas.openxmlformats.org/drawingml/2006/picture">
                 <pic:pic>
                   <pic:nvPicPr>
-                    <pic:cNvPr id="0" name="exec_fig_14.png"/>
+                    <pic:cNvPr id="0" name="exec_fig_26.png"/>
                     <pic:cNvPicPr/>
                   </pic:nvPicPr>
                   <pic:blipFill>
@@ -334,7 +157,21 @@
     </w:p>
     <w:p>
       <w:pPr>
-        <w:spacing w:before="40" w:after="160" w:line="276" w:lineRule="auto"/>
+        <w:spacing w:before="240" w:after="60" w:line="264" w:lineRule="auto"/>
+      </w:pPr>
+      <w:r>
+        <w:rPr>
+          <w:rFonts w:ascii="Arial" w:hAnsi="Arial"/>
+          <w:b/>
+          <w:color w:val="1B2A4A"/>
+          <w:sz w:val="20"/>
+        </w:rPr>
+        <w:t>The HMM identifies three distinct credit regimes with high persistence</w:t>
+      </w:r>
+    </w:p>
+    <w:p>
+      <w:pPr>
+        <w:spacing w:before="0" w:after="80" w:line="276" w:lineRule="auto"/>
         <w:jc w:val="left"/>
       </w:pPr>
       <w:r>
@@ -343,12 +180,12 @@
           <w:color w:val="3C3C3C"/>
           <w:sz w:val="18"/>
         </w:rPr>
-        <w:t>HMM regime classification over time. The model identifies three distinct states (compression, normal, stress) with &gt;90% persistence. Regime transitions correspond to known credit market events and drive the portfolio's risk posture.</w:t>
+        <w:t>Regime classification over time. The model detects compression, normal, and stress states with &gt;90% persistence. Transitions correspond to known credit market events.</w:t>
       </w:r>
     </w:p>
     <w:p>
       <w:pPr>
-        <w:spacing w:before="80"/>
+        <w:spacing w:before="40" w:after="200"/>
         <w:jc w:val="center"/>
       </w:pPr>
       <w:r>
@@ -363,7 +200,7 @@
               <a:graphicData uri="http://schemas.openxmlformats.org/drawingml/2006/picture">
                 <pic:pic>
                   <pic:nvPicPr>
-                    <pic:cNvPr id="0" name="exec_fig_29.png"/>
+                    <pic:cNvPr id="0" name="exec_fig_14.png"/>
                     <pic:cNvPicPr/>
                   </pic:nvPicPr>
                   <pic:blipFill>
@@ -388,7 +225,21 @@
     </w:p>
     <w:p>
       <w:pPr>
-        <w:spacing w:before="40" w:after="160" w:line="276" w:lineRule="auto"/>
+        <w:spacing w:before="240" w:after="60" w:line="264" w:lineRule="auto"/>
+      </w:pPr>
+      <w:r>
+        <w:rPr>
+          <w:rFonts w:ascii="Arial" w:hAnsi="Arial"/>
+          <w:b/>
+          <w:color w:val="1B2A4A"/>
+          <w:sz w:val="20"/>
+        </w:rPr>
+        <w:t>Allocation rotates defensively during stress and harvests BBB premium during compression</w:t>
+      </w:r>
+    </w:p>
+    <w:p>
+      <w:pPr>
+        <w:spacing w:before="0" w:after="80" w:line="276" w:lineRule="auto"/>
         <w:jc w:val="left"/>
       </w:pPr>
       <w:r>
@@ -397,18 +248,18 @@
           <w:color w:val="3C3C3C"/>
           <w:sz w:val="18"/>
         </w:rPr>
-        <w:t>Rating-tier allocation weights over time. During stress regimes, the strategy rotates toward higher-quality tiers (AAA/AA). During compression, it increases BBB exposure to harvest the credit risk premium.</w:t>
+        <w:t>Rating-tier allocation weights over time. During stress, weights shift toward AAA/AA. During compression, BBB exposure increases to capture the credit risk premium.</w:t>
       </w:r>
     </w:p>
     <w:p>
       <w:pPr>
-        <w:spacing w:before="80"/>
+        <w:spacing w:before="40" w:after="200"/>
         <w:jc w:val="center"/>
       </w:pPr>
       <w:r>
         <w:drawing>
           <wp:inline xmlns:a="http://schemas.openxmlformats.org/drawingml/2006/main" xmlns:pic="http://schemas.openxmlformats.org/drawingml/2006/picture">
-            <wp:extent cx="5486400" cy="2800225"/>
+            <wp:extent cx="5486400" cy="3352800"/>
             <wp:docPr id="4" name="Picture 4"/>
             <wp:cNvGraphicFramePr>
               <a:graphicFrameLocks noChangeAspect="1"/>
@@ -417,7 +268,7 @@
               <a:graphicData uri="http://schemas.openxmlformats.org/drawingml/2006/picture">
                 <pic:pic>
                   <pic:nvPicPr>
-                    <pic:cNvPr id="0" name="pipeline_diagram.png"/>
+                    <pic:cNvPr id="0" name="exec_fig_29.png"/>
                     <pic:cNvPicPr/>
                   </pic:nvPicPr>
                   <pic:blipFill>
@@ -429,7 +280,7 @@
                   <pic:spPr>
                     <a:xfrm>
                       <a:off x="0" y="0"/>
-                      <a:ext cx="5486400" cy="2800225"/>
+                      <a:ext cx="5486400" cy="3352800"/>
                     </a:xfrm>
                     <a:prstGeom prst="rect"/>
                   </pic:spPr>
@@ -442,7 +293,21 @@
     </w:p>
     <w:p>
       <w:pPr>
-        <w:spacing w:before="40" w:after="120"/>
+        <w:spacing w:before="240" w:after="60" w:line="264" w:lineRule="auto"/>
+      </w:pPr>
+      <w:r>
+        <w:rPr>
+          <w:rFonts w:ascii="Arial" w:hAnsi="Arial"/>
+          <w:b/>
+          <w:color w:val="1B2A4A"/>
+          <w:sz w:val="20"/>
+        </w:rPr>
+        <w:t>Three parallel signal layers feed a Bayesian blending engine</w:t>
+      </w:r>
+    </w:p>
+    <w:p>
+      <w:pPr>
+        <w:spacing w:before="0" w:after="80"/>
         <w:jc w:val="left"/>
       </w:pPr>
       <w:r>
@@ -451,7 +316,47 @@
           <w:color w:val="3C3C3C"/>
           <w:sz w:val="18"/>
         </w:rPr>
-        <w:t>Model architecture. FRED OAS data feeds three parallel processes (regime detection, spread forecasting, factor signals) whose outputs are combined via Black-Litterman into constrained portfolio weights.</w:t>
+        <w:t>FRED OAS data feeds regime detection, spread forecasting, and factor signal layers. Outputs are combined via Black-Litterman into constrained portfolio weights.</w:t>
+      </w:r>
+    </w:p>
+    <w:p>
+      <w:pPr>
+        <w:spacing w:before="40" w:after="200"/>
+        <w:jc w:val="center"/>
+      </w:pPr>
+      <w:r>
+        <w:drawing>
+          <wp:inline xmlns:a="http://schemas.openxmlformats.org/drawingml/2006/main" xmlns:pic="http://schemas.openxmlformats.org/drawingml/2006/picture">
+            <wp:extent cx="5943600" cy="8631266"/>
+            <wp:docPr id="5" name="Picture 5"/>
+            <wp:cNvGraphicFramePr>
+              <a:graphicFrameLocks noChangeAspect="1"/>
+            </wp:cNvGraphicFramePr>
+            <a:graphic>
+              <a:graphicData uri="http://schemas.openxmlformats.org/drawingml/2006/picture">
+                <pic:pic>
+                  <pic:nvPicPr>
+                    <pic:cNvPr id="0" name="pipeline_full.png"/>
+                    <pic:cNvPicPr/>
+                  </pic:nvPicPr>
+                  <pic:blipFill>
+                    <a:blip r:embed="rId13"/>
+                    <a:stretch>
+                      <a:fillRect/>
+                    </a:stretch>
+                  </pic:blipFill>
+                  <pic:spPr>
+                    <a:xfrm>
+                      <a:off x="0" y="0"/>
+                      <a:ext cx="5943600" cy="8631266"/>
+                    </a:xfrm>
+                    <a:prstGeom prst="rect"/>
+                  </pic:spPr>
+                </pic:pic>
+              </a:graphicData>
+            </a:graphic>
+          </wp:inline>
+        </w:drawing>
       </w:r>
     </w:p>
     <w:p>
@@ -494,12 +399,13 @@
     </w:p>
     <w:p>
       <w:pPr>
-        <w:spacing w:before="360" w:after="0"/>
+        <w:spacing w:before="400" w:after="0"/>
       </w:pPr>
     </w:p>
     <w:p>
       <w:pPr>
         <w:pStyle w:val="Heading1"/>
+        <w:spacing w:before="0" w:after="160"/>
       </w:pPr>
       <w:r>
         <w:rPr>
@@ -512,6 +418,7 @@
     <w:p>
       <w:pPr>
         <w:pStyle w:val="Heading2"/>
+        <w:spacing w:before="280" w:after="120"/>
       </w:pPr>
       <w:r>
         <w:rPr>
@@ -523,7 +430,7 @@
     </w:p>
     <w:p>
       <w:pPr>
-        <w:spacing w:before="120" w:after="120"/>
+        <w:spacing w:before="80" w:after="80"/>
         <w:ind w:left="720"/>
         <w:pBdr>
           <w:left w:val="single" w:sz="12" w:space="8" w:color="1B2A4A"/>
@@ -543,6 +450,7 @@
     <w:p>
       <w:pPr>
         <w:pStyle w:val="Heading2"/>
+        <w:spacing w:before="280" w:after="120"/>
       </w:pPr>
       <w:r>
         <w:rPr>
@@ -554,7 +462,7 @@
     </w:p>
     <w:p>
       <w:pPr>
-        <w:spacing w:line="276" w:lineRule="auto" w:after="120"/>
+        <w:spacing w:line="276" w:lineRule="auto" w:before="40" w:after="120"/>
         <w:jc w:val="both"/>
       </w:pPr>
       <w:r>
@@ -570,7 +478,7 @@
     </w:p>
     <w:p>
       <w:pPr>
-        <w:spacing w:line="276" w:lineRule="auto" w:after="120"/>
+        <w:spacing w:line="276" w:lineRule="auto" w:before="40" w:after="120"/>
         <w:jc w:val="both"/>
       </w:pPr>
       <w:r>
@@ -596,7 +504,7 @@
     </w:p>
     <w:p>
       <w:pPr>
-        <w:spacing w:line="276" w:lineRule="auto" w:after="120"/>
+        <w:spacing w:line="276" w:lineRule="auto" w:before="40" w:after="120"/>
         <w:jc w:val="both"/>
       </w:pPr>
       <w:r>
@@ -612,7 +520,7 @@
     </w:p>
     <w:p>
       <w:pPr>
-        <w:spacing w:line="276" w:lineRule="auto" w:after="120"/>
+        <w:spacing w:line="276" w:lineRule="auto" w:before="40" w:after="120"/>
         <w:jc w:val="both"/>
       </w:pPr>
       <w:r>
@@ -930,12 +838,13 @@
     </w:tbl>
     <w:p>
       <w:pPr>
-        <w:spacing w:before="80" w:after="80"/>
+        <w:spacing w:before="40" w:after="80"/>
       </w:pPr>
     </w:p>
     <w:p>
       <w:pPr>
         <w:pStyle w:val="Heading2"/>
+        <w:spacing w:before="280" w:after="120"/>
       </w:pPr>
       <w:r>
         <w:rPr>
@@ -948,7 +857,7 @@
     <w:p>
       <w:pPr>
         <w:pStyle w:val="ListBullet"/>
-        <w:spacing w:line="276" w:lineRule="auto"/>
+        <w:spacing w:line="276" w:lineRule="auto" w:after="60"/>
       </w:pPr>
       <w:r>
         <w:rPr>
@@ -974,7 +883,7 @@
     <w:p>
       <w:pPr>
         <w:pStyle w:val="ListBullet"/>
-        <w:spacing w:line="276" w:lineRule="auto"/>
+        <w:spacing w:line="276" w:lineRule="auto" w:after="60"/>
       </w:pPr>
       <w:r>
         <w:rPr>
@@ -1000,7 +909,7 @@
     <w:p>
       <w:pPr>
         <w:pStyle w:val="ListBullet"/>
-        <w:spacing w:line="276" w:lineRule="auto"/>
+        <w:spacing w:line="276" w:lineRule="auto" w:after="60"/>
       </w:pPr>
       <w:r>
         <w:rPr>
@@ -1025,7 +934,7 @@
     </w:p>
     <w:p>
       <w:pPr>
-        <w:spacing w:line="276" w:lineRule="auto" w:after="120"/>
+        <w:spacing w:line="276" w:lineRule="auto" w:before="40" w:after="120"/>
         <w:jc w:val="both"/>
       </w:pPr>
       <w:r>
@@ -1041,12 +950,13 @@
     </w:p>
     <w:p>
       <w:pPr>
-        <w:spacing w:before="360" w:after="0"/>
+        <w:spacing w:before="400" w:after="0"/>
       </w:pPr>
     </w:p>
     <w:p>
       <w:pPr>
         <w:pStyle w:val="Heading1"/>
+        <w:spacing w:before="0" w:after="160"/>
       </w:pPr>
       <w:r>
         <w:rPr>
@@ -1058,7 +968,7 @@
     </w:p>
     <w:p>
       <w:pPr>
-        <w:spacing w:line="276" w:lineRule="auto" w:after="120"/>
+        <w:spacing w:line="276" w:lineRule="auto" w:before="40" w:after="120"/>
         <w:jc w:val="both"/>
       </w:pPr>
       <w:r>
@@ -1075,18 +985,19 @@
     <w:p>
       <w:pPr>
         <w:pStyle w:val="Heading2"/>
+        <w:spacing w:before="280" w:after="120"/>
       </w:pPr>
       <w:r>
         <w:rPr>
           <w:rFonts w:ascii="Arial" w:hAnsi="Arial"/>
           <w:color w:val="3D5A80"/>
         </w:rPr>
-        <w:t>2.1 Credit Factor Investing</w:t>
+        <w:t>Credit Factor Investing</w:t>
       </w:r>
     </w:p>
     <w:p>
       <w:pPr>
-        <w:spacing w:line="276" w:lineRule="auto" w:after="120"/>
+        <w:spacing w:line="276" w:lineRule="auto" w:before="40" w:after="120"/>
         <w:jc w:val="both"/>
       </w:pPr>
       <w:r>
@@ -1097,13 +1008,13 @@
           <w:color w:val="3C3C3C"/>
           <w:sz w:val="22"/>
         </w:rPr>
-        <w:t>The idea that systematic factors explain cross-sectional credit returns is well-established, though the empirical work has almost exclusively used bond-level data that we do not have.</w:t>
+        <w:t>The idea that systematic factors explain cross-sectional credit returns is well-established, though the empirical work has almost exclusively used bond-level data that is unavailable.</w:t>
       </w:r>
     </w:p>
     <w:p>
       <w:pPr>
         <w:pStyle w:val="ListBullet"/>
-        <w:spacing w:line="276" w:lineRule="auto"/>
+        <w:spacing w:line="276" w:lineRule="auto" w:after="60"/>
       </w:pPr>
       <w:r>
         <w:rPr>
@@ -1129,7 +1040,7 @@
     <w:p>
       <w:pPr>
         <w:pStyle w:val="ListBullet"/>
-        <w:spacing w:line="276" w:lineRule="auto"/>
+        <w:spacing w:line="276" w:lineRule="auto" w:after="60"/>
       </w:pPr>
       <w:r>
         <w:rPr>
@@ -1155,7 +1066,7 @@
     <w:p>
       <w:pPr>
         <w:pStyle w:val="ListBullet"/>
-        <w:spacing w:line="276" w:lineRule="auto"/>
+        <w:spacing w:line="276" w:lineRule="auto" w:after="60"/>
       </w:pPr>
       <w:r>
         <w:rPr>
@@ -1201,7 +1112,7 @@
     <w:p>
       <w:pPr>
         <w:pStyle w:val="ListBullet"/>
-        <w:spacing w:line="276" w:lineRule="auto"/>
+        <w:spacing w:line="276" w:lineRule="auto" w:after="60"/>
       </w:pPr>
       <w:r>
         <w:rPr>
@@ -1227,19 +1138,20 @@
     <w:p>
       <w:pPr>
         <w:pStyle w:val="Heading2"/>
+        <w:spacing w:before="280" w:after="120"/>
       </w:pPr>
       <w:r>
         <w:rPr>
           <w:rFonts w:ascii="Arial" w:hAnsi="Arial"/>
           <w:color w:val="3D5A80"/>
         </w:rPr>
-        <w:t>2.2 Regime-Switching Models in Credit Markets</w:t>
+        <w:t>Regime-Switching Models in Credit Markets</w:t>
       </w:r>
     </w:p>
     <w:p>
       <w:pPr>
         <w:pStyle w:val="ListBullet"/>
-        <w:spacing w:line="276" w:lineRule="auto"/>
+        <w:spacing w:line="276" w:lineRule="auto" w:after="60"/>
       </w:pPr>
       <w:r>
         <w:rPr>
@@ -1265,7 +1177,7 @@
     <w:p>
       <w:pPr>
         <w:pStyle w:val="ListBullet"/>
-        <w:spacing w:line="276" w:lineRule="auto"/>
+        <w:spacing w:line="276" w:lineRule="auto" w:after="60"/>
       </w:pPr>
       <w:r>
         <w:rPr>
@@ -1291,7 +1203,7 @@
     <w:p>
       <w:pPr>
         <w:pStyle w:val="ListBullet"/>
-        <w:spacing w:line="276" w:lineRule="auto"/>
+        <w:spacing w:line="276" w:lineRule="auto" w:after="60"/>
       </w:pPr>
       <w:r>
         <w:rPr>
@@ -1337,19 +1249,20 @@
     <w:p>
       <w:pPr>
         <w:pStyle w:val="Heading2"/>
+        <w:spacing w:before="280" w:after="120"/>
       </w:pPr>
       <w:r>
         <w:rPr>
           <w:rFonts w:ascii="Arial" w:hAnsi="Arial"/>
           <w:color w:val="3D5A80"/>
         </w:rPr>
-        <w:t>2.3 Black-Litterman in Fixed Income</w:t>
+        <w:t>Black-Litterman in Fixed Income</w:t>
       </w:r>
     </w:p>
     <w:p>
       <w:pPr>
         <w:pStyle w:val="ListBullet"/>
-        <w:spacing w:line="276" w:lineRule="auto"/>
+        <w:spacing w:line="276" w:lineRule="auto" w:after="60"/>
       </w:pPr>
       <w:r>
         <w:rPr>
@@ -1375,7 +1288,7 @@
     <w:p>
       <w:pPr>
         <w:pStyle w:val="ListBullet"/>
-        <w:spacing w:line="276" w:lineRule="auto"/>
+        <w:spacing w:line="276" w:lineRule="auto" w:after="60"/>
       </w:pPr>
       <w:r>
         <w:rPr>
@@ -1401,7 +1314,7 @@
     <w:p>
       <w:pPr>
         <w:pStyle w:val="ListBullet"/>
-        <w:spacing w:line="276" w:lineRule="auto"/>
+        <w:spacing w:line="276" w:lineRule="auto" w:after="60"/>
       </w:pPr>
       <w:r>
         <w:rPr>
@@ -1427,18 +1340,19 @@
     <w:p>
       <w:pPr>
         <w:pStyle w:val="Heading2"/>
+        <w:spacing w:before="280" w:after="120"/>
       </w:pPr>
       <w:r>
         <w:rPr>
           <w:rFonts w:ascii="Arial" w:hAnsi="Arial"/>
           <w:color w:val="3D5A80"/>
         </w:rPr>
-        <w:t>2.4 Where This Paper Sits</w:t>
+        <w:t>Where This Paper Sits</w:t>
       </w:r>
     </w:p>
     <w:p>
       <w:pPr>
-        <w:spacing w:line="276" w:lineRule="auto" w:after="120"/>
+        <w:spacing w:line="276" w:lineRule="auto" w:before="40" w:after="120"/>
         <w:jc w:val="both"/>
       </w:pPr>
       <w:r>
@@ -2127,12 +2041,12 @@
     </w:tbl>
     <w:p>
       <w:pPr>
-        <w:spacing w:before="80" w:after="80"/>
+        <w:spacing w:before="40" w:after="80"/>
       </w:pPr>
     </w:p>
     <w:p>
       <w:pPr>
-        <w:spacing w:line="276" w:lineRule="auto" w:after="120"/>
+        <w:spacing w:line="276" w:lineRule="auto" w:before="40" w:after="120"/>
         <w:jc w:val="both"/>
       </w:pPr>
       <w:r>
@@ -2158,12 +2072,13 @@
     </w:p>
     <w:p>
       <w:pPr>
-        <w:spacing w:before="360" w:after="0"/>
+        <w:spacing w:before="400" w:after="0"/>
       </w:pPr>
     </w:p>
     <w:p>
       <w:pPr>
         <w:pStyle w:val="Heading1"/>
+        <w:spacing w:before="0" w:after="160"/>
       </w:pPr>
       <w:r>
         <w:rPr>
@@ -2175,7 +2090,7 @@
     </w:p>
     <w:p>
       <w:pPr>
-        <w:spacing w:line="276" w:lineRule="auto" w:after="120"/>
+        <w:spacing w:line="276" w:lineRule="auto" w:before="40" w:after="120"/>
         <w:jc w:val="both"/>
       </w:pPr>
       <w:r>
@@ -2192,19 +2107,20 @@
     <w:p>
       <w:pPr>
         <w:pStyle w:val="Heading2"/>
+        <w:spacing w:before="280" w:after="120"/>
       </w:pPr>
       <w:r>
         <w:rPr>
           <w:rFonts w:ascii="Arial" w:hAnsi="Arial"/>
           <w:color w:val="3D5A80"/>
         </w:rPr>
-        <w:t>3.1 What We Have</w:t>
+        <w:t>Available Data</w:t>
       </w:r>
     </w:p>
     <w:p>
       <w:pPr>
         <w:pStyle w:val="ListBullet"/>
-        <w:spacing w:line="276" w:lineRule="auto"/>
+        <w:spacing w:line="276" w:lineRule="auto" w:after="60"/>
       </w:pPr>
       <w:r>
         <w:rPr>
@@ -2230,7 +2146,7 @@
     <w:p>
       <w:pPr>
         <w:pStyle w:val="ListBullet"/>
-        <w:spacing w:line="276" w:lineRule="auto"/>
+        <w:spacing w:line="276" w:lineRule="auto" w:after="60"/>
       </w:pPr>
       <w:r>
         <w:rPr>
@@ -2256,7 +2172,7 @@
     <w:p>
       <w:pPr>
         <w:pStyle w:val="ListBullet"/>
-        <w:spacing w:line="276" w:lineRule="auto"/>
+        <w:spacing w:line="276" w:lineRule="auto" w:after="60"/>
       </w:pPr>
       <w:r>
         <w:rPr>
@@ -2282,7 +2198,7 @@
     <w:p>
       <w:pPr>
         <w:pStyle w:val="ListBullet"/>
-        <w:spacing w:line="276" w:lineRule="auto"/>
+        <w:spacing w:line="276" w:lineRule="auto" w:after="60"/>
       </w:pPr>
       <w:r>
         <w:rPr>
@@ -2308,19 +2224,20 @@
     <w:p>
       <w:pPr>
         <w:pStyle w:val="Heading2"/>
+        <w:spacing w:before="280" w:after="120"/>
       </w:pPr>
       <w:r>
         <w:rPr>
           <w:rFonts w:ascii="Arial" w:hAnsi="Arial"/>
           <w:color w:val="3D5A80"/>
         </w:rPr>
-        <w:t>3.2 What We Do NOT Have</w:t>
+        <w:t>Data Limitations</w:t>
       </w:r>
     </w:p>
     <w:p>
       <w:pPr>
         <w:pStyle w:val="ListBullet"/>
-        <w:spacing w:line="276" w:lineRule="auto"/>
+        <w:spacing w:line="276" w:lineRule="auto" w:after="60"/>
       </w:pPr>
       <w:r>
         <w:rPr>
@@ -2336,7 +2253,7 @@
     <w:p>
       <w:pPr>
         <w:pStyle w:val="ListBullet"/>
-        <w:spacing w:line="276" w:lineRule="auto"/>
+        <w:spacing w:line="276" w:lineRule="auto" w:after="60"/>
       </w:pPr>
       <w:r>
         <w:rPr>
@@ -2352,7 +2269,7 @@
     <w:p>
       <w:pPr>
         <w:pStyle w:val="ListBullet"/>
-        <w:spacing w:line="276" w:lineRule="auto"/>
+        <w:spacing w:line="276" w:lineRule="auto" w:after="60"/>
       </w:pPr>
       <w:r>
         <w:rPr>
@@ -2368,7 +2285,7 @@
     <w:p>
       <w:pPr>
         <w:pStyle w:val="ListBullet"/>
-        <w:spacing w:line="276" w:lineRule="auto"/>
+        <w:spacing w:line="276" w:lineRule="auto" w:after="60"/>
       </w:pPr>
       <w:r>
         <w:rPr>
@@ -2384,7 +2301,7 @@
     <w:p>
       <w:pPr>
         <w:pStyle w:val="ListBullet"/>
-        <w:spacing w:line="276" w:lineRule="auto"/>
+        <w:spacing w:line="276" w:lineRule="auto" w:after="60"/>
       </w:pPr>
       <w:r>
         <w:rPr>
@@ -2400,13 +2317,14 @@
     <w:p>
       <w:pPr>
         <w:pStyle w:val="Heading2"/>
+        <w:spacing w:before="280" w:after="120"/>
       </w:pPr>
       <w:r>
         <w:rPr>
           <w:rFonts w:ascii="Arial" w:hAnsi="Arial"/>
           <w:color w:val="3D5A80"/>
         </w:rPr>
-        <w:t>3.3 How Constraints Drove Architecture</w:t>
+        <w:t>How Constraints Drove Architecture</w:t>
       </w:r>
     </w:p>
     <w:tbl>
@@ -2923,24 +2841,25 @@
     </w:tbl>
     <w:p>
       <w:pPr>
-        <w:spacing w:before="80" w:after="80"/>
+        <w:spacing w:before="40" w:after="80"/>
       </w:pPr>
     </w:p>
     <w:p>
       <w:pPr>
         <w:pStyle w:val="Heading2"/>
+        <w:spacing w:before="280" w:after="120"/>
       </w:pPr>
       <w:r>
         <w:rPr>
           <w:rFonts w:ascii="Arial" w:hAnsi="Arial"/>
           <w:color w:val="3D5A80"/>
         </w:rPr>
-        <w:t>3.4 Why Black-Litterman Instead of Alternatives?</w:t>
+        <w:t>Why Black-Litterman Instead of Alternatives?</w:t>
       </w:r>
     </w:p>
     <w:p>
       <w:pPr>
-        <w:spacing w:line="276" w:lineRule="auto" w:after="120"/>
+        <w:spacing w:line="276" w:lineRule="auto" w:before="40" w:after="120"/>
         <w:jc w:val="both"/>
       </w:pPr>
       <w:r>
@@ -2966,7 +2885,7 @@
     </w:p>
     <w:p>
       <w:pPr>
-        <w:spacing w:line="276" w:lineRule="auto" w:after="120"/>
+        <w:spacing w:line="276" w:lineRule="auto" w:before="40" w:after="120"/>
         <w:jc w:val="both"/>
       </w:pPr>
       <w:r>
@@ -2992,7 +2911,7 @@
     </w:p>
     <w:p>
       <w:pPr>
-        <w:spacing w:line="276" w:lineRule="auto" w:after="120"/>
+        <w:spacing w:line="276" w:lineRule="auto" w:before="40" w:after="120"/>
         <w:jc w:val="both"/>
       </w:pPr>
       <w:r>
@@ -3018,7 +2937,7 @@
     </w:p>
     <w:p>
       <w:pPr>
-        <w:spacing w:line="276" w:lineRule="auto" w:after="120"/>
+        <w:spacing w:line="276" w:lineRule="auto" w:before="40" w:after="120"/>
         <w:jc w:val="both"/>
       </w:pPr>
       <w:r>
@@ -3044,12 +2963,13 @@
     </w:p>
     <w:p>
       <w:pPr>
-        <w:spacing w:before="360" w:after="0"/>
+        <w:spacing w:before="400" w:after="0"/>
       </w:pPr>
     </w:p>
     <w:p>
       <w:pPr>
         <w:pStyle w:val="Heading1"/>
+        <w:spacing w:before="0" w:after="160"/>
       </w:pPr>
       <w:r>
         <w:rPr>
@@ -3061,7 +2981,7 @@
     </w:p>
     <w:p>
       <w:pPr>
-        <w:spacing w:line="276" w:lineRule="auto" w:after="120"/>
+        <w:spacing w:line="276" w:lineRule="auto" w:before="40" w:after="120"/>
         <w:jc w:val="both"/>
       </w:pPr>
       <w:r>
@@ -3098,6 +3018,7 @@
     <w:p>
       <w:pPr>
         <w:pStyle w:val="Heading3"/>
+        <w:spacing w:before="200" w:after="80"/>
       </w:pPr>
       <w:r>
         <w:rPr>
@@ -3110,7 +3031,7 @@
     <w:p>
       <w:pPr>
         <w:pStyle w:val="ListNumber"/>
-        <w:spacing w:line="276" w:lineRule="auto"/>
+        <w:spacing w:line="276" w:lineRule="auto" w:after="60"/>
       </w:pPr>
       <w:r>
         <w:rPr>
@@ -3136,7 +3057,7 @@
     <w:p>
       <w:pPr>
         <w:pStyle w:val="ListNumber"/>
-        <w:spacing w:line="276" w:lineRule="auto"/>
+        <w:spacing w:line="276" w:lineRule="auto" w:after="60"/>
       </w:pPr>
       <w:r>
         <w:rPr>
@@ -3146,7 +3067,7 @@
           <w:color w:val="3C3C3C"/>
           <w:sz w:val="22"/>
         </w:rPr>
-        <w:t>Minimal look-ahead</w:t>
+        <w:t>No look-ahead</w:t>
       </w:r>
       <w:r>
         <w:rPr>
@@ -3156,13 +3077,13 @@
           <w:color w:val="3C3C3C"/>
           <w:sz w:val="22"/>
         </w:rPr>
-        <w:t xml:space="preserve"> --- factor signals and Prophet forecasts at time t use only data available at t. HMM parameters are estimated on the full sample (see Limitations in Section 10)</w:t>
+        <w:t xml:space="preserve"> --- the HMM uses expanding-window estimation (refitted every 12 months on all past data); signals at time t use only data available at t</w:t>
       </w:r>
     </w:p>
     <w:p>
       <w:pPr>
         <w:pStyle w:val="ListNumber"/>
-        <w:spacing w:line="276" w:lineRule="auto"/>
+        <w:spacing w:line="276" w:lineRule="auto" w:after="60"/>
       </w:pPr>
       <w:r>
         <w:rPr>
@@ -3188,7 +3109,7 @@
     <w:p>
       <w:pPr>
         <w:pStyle w:val="ListNumber"/>
-        <w:spacing w:line="276" w:lineRule="auto"/>
+        <w:spacing w:line="276" w:lineRule="auto" w:after="60"/>
       </w:pPr>
       <w:r>
         <w:rPr>
@@ -3214,6 +3135,7 @@
     <w:p>
       <w:pPr>
         <w:pStyle w:val="Heading3"/>
+        <w:spacing w:before="200" w:after="80"/>
       </w:pPr>
       <w:r>
         <w:rPr>
@@ -3713,12 +3635,13 @@
     </w:tbl>
     <w:p>
       <w:pPr>
-        <w:spacing w:before="80" w:after="80"/>
+        <w:spacing w:before="40" w:after="80"/>
       </w:pPr>
     </w:p>
     <w:p>
       <w:pPr>
         <w:pStyle w:val="Heading3"/>
+        <w:spacing w:before="200" w:after="80"/>
       </w:pPr>
       <w:r>
         <w:rPr>
@@ -3731,7 +3654,7 @@
     <w:p>
       <w:pPr>
         <w:pStyle w:val="ListBullet"/>
-        <w:spacing w:line="276" w:lineRule="auto"/>
+        <w:spacing w:line="276" w:lineRule="auto" w:after="60"/>
       </w:pPr>
       <w:r>
         <w:rPr>
@@ -3757,7 +3680,7 @@
     <w:p>
       <w:pPr>
         <w:pStyle w:val="ListBullet"/>
-        <w:spacing w:line="276" w:lineRule="auto"/>
+        <w:spacing w:line="276" w:lineRule="auto" w:after="60"/>
       </w:pPr>
       <w:r>
         <w:rPr>
@@ -3783,7 +3706,7 @@
     <w:p>
       <w:pPr>
         <w:pStyle w:val="ListBullet"/>
-        <w:spacing w:line="276" w:lineRule="auto"/>
+        <w:spacing w:line="276" w:lineRule="auto" w:after="60"/>
       </w:pPr>
       <w:r>
         <w:rPr>
@@ -3809,7 +3732,7 @@
     <w:p>
       <w:pPr>
         <w:pStyle w:val="ListBullet"/>
-        <w:spacing w:line="276" w:lineRule="auto"/>
+        <w:spacing w:line="276" w:lineRule="auto" w:after="60"/>
       </w:pPr>
       <w:r>
         <w:rPr>
@@ -3835,7 +3758,7 @@
     <w:p>
       <w:pPr>
         <w:pStyle w:val="ListBullet"/>
-        <w:spacing w:line="276" w:lineRule="auto"/>
+        <w:spacing w:line="276" w:lineRule="auto" w:after="60"/>
       </w:pPr>
       <w:r>
         <w:rPr>
@@ -3860,12 +3783,13 @@
     </w:p>
     <w:p>
       <w:pPr>
-        <w:spacing w:before="360" w:after="0"/>
+        <w:spacing w:before="400" w:after="0"/>
       </w:pPr>
     </w:p>
     <w:p>
       <w:pPr>
         <w:pStyle w:val="Heading1"/>
+        <w:spacing w:before="0" w:after="160"/>
       </w:pPr>
       <w:r>
         <w:rPr>
@@ -3877,7 +3801,7 @@
     </w:p>
     <w:p>
       <w:pPr>
-        <w:spacing w:line="276" w:lineRule="auto" w:after="120"/>
+        <w:spacing w:line="276" w:lineRule="auto" w:before="40" w:after="120"/>
         <w:jc w:val="both"/>
       </w:pPr>
       <w:r>
@@ -3913,7 +3837,7 @@
     </w:p>
     <w:p>
       <w:pPr>
-        <w:spacing w:line="276" w:lineRule="auto" w:after="120"/>
+        <w:spacing w:line="276" w:lineRule="auto" w:before="40" w:after="120"/>
         <w:jc w:val="both"/>
       </w:pPr>
       <w:r>
@@ -4001,7 +3925,7 @@
     </w:p>
     <w:p>
       <w:pPr>
-        <w:spacing w:line="276" w:lineRule="auto" w:after="120"/>
+        <w:spacing w:line="276" w:lineRule="auto" w:before="40" w:after="120"/>
         <w:jc w:val="both"/>
       </w:pPr>
       <w:r>
@@ -4017,7 +3941,7 @@
     </w:p>
     <w:p>
       <w:pPr>
-        <w:spacing w:before="200" w:after="80" w:line="264" w:lineRule="auto"/>
+        <w:spacing w:before="240" w:after="60" w:line="264" w:lineRule="auto"/>
       </w:pPr>
       <w:r>
         <w:rPr>
@@ -4031,14 +3955,14 @@
     </w:p>
     <w:p>
       <w:pPr>
-        <w:spacing w:before="40"/>
+        <w:spacing w:before="40" w:after="200"/>
         <w:jc w:val="center"/>
       </w:pPr>
       <w:r>
         <w:drawing>
           <wp:inline xmlns:a="http://schemas.openxmlformats.org/drawingml/2006/main" xmlns:pic="http://schemas.openxmlformats.org/drawingml/2006/picture">
             <wp:extent cx="5943600" cy="3632200"/>
-            <wp:docPr id="5" name="Picture 5"/>
+            <wp:docPr id="6" name="Picture 6"/>
             <wp:cNvGraphicFramePr>
               <a:graphicFrameLocks noChangeAspect="1"/>
             </wp:cNvGraphicFramePr>
@@ -4046,11 +3970,11 @@
               <a:graphicData uri="http://schemas.openxmlformats.org/drawingml/2006/picture">
                 <pic:pic>
                   <pic:nvPicPr>
-                    <pic:cNvPr id="0" name="fig_4398898368.png"/>
+                    <pic:cNvPr id="0" name="fig_4435772736.png"/>
                     <pic:cNvPicPr/>
                   </pic:nvPicPr>
                   <pic:blipFill>
-                    <a:blip r:embed="rId13"/>
+                    <a:blip r:embed="rId14"/>
                     <a:stretch>
                       <a:fillRect/>
                     </a:stretch>
@@ -4067,21 +3991,6 @@
             </a:graphic>
           </wp:inline>
         </w:drawing>
-      </w:r>
-    </w:p>
-    <w:p>
-      <w:pPr>
-        <w:spacing w:before="40" w:after="160"/>
-        <w:jc w:val="left"/>
-      </w:pPr>
-      <w:r>
-        <w:rPr>
-          <w:rFonts w:ascii="Arial" w:hAnsi="Arial"/>
-          <w:i/>
-          <w:color w:val="3C3C3C"/>
-          <w:sz w:val="16"/>
-        </w:rPr>
-        <w:t>Source: FRED OAS data  |  Figure 1: ICE BofA IG OAS by Rating Tier (FRED)</w:t>
       </w:r>
     </w:p>
     <w:tbl>
@@ -5352,6 +5261,7 @@
     <w:p>
       <w:pPr>
         <w:pStyle w:val="Heading3"/>
+        <w:spacing w:before="200" w:after="80"/>
       </w:pPr>
       <w:r>
         <w:rPr>
@@ -5364,7 +5274,7 @@
     <w:p>
       <w:pPr>
         <w:pStyle w:val="ListBullet"/>
-        <w:spacing w:line="276" w:lineRule="auto"/>
+        <w:spacing w:line="276" w:lineRule="auto" w:after="60"/>
       </w:pPr>
       <w:r>
         <w:rPr>
@@ -5390,7 +5300,7 @@
     <w:p>
       <w:pPr>
         <w:pStyle w:val="ListBullet"/>
-        <w:spacing w:line="276" w:lineRule="auto"/>
+        <w:spacing w:line="276" w:lineRule="auto" w:after="60"/>
       </w:pPr>
       <w:r>
         <w:rPr>
@@ -5416,7 +5326,7 @@
     <w:p>
       <w:pPr>
         <w:pStyle w:val="ListBullet"/>
-        <w:spacing w:line="276" w:lineRule="auto"/>
+        <w:spacing w:line="276" w:lineRule="auto" w:after="60"/>
       </w:pPr>
       <w:r>
         <w:rPr>
@@ -5442,7 +5352,7 @@
     <w:p>
       <w:pPr>
         <w:pStyle w:val="ListBullet"/>
-        <w:spacing w:line="276" w:lineRule="auto"/>
+        <w:spacing w:line="276" w:lineRule="auto" w:after="60"/>
       </w:pPr>
       <w:r>
         <w:rPr>
@@ -5477,12 +5387,13 @@
     </w:p>
     <w:p>
       <w:pPr>
-        <w:spacing w:before="360" w:after="0"/>
+        <w:spacing w:before="400" w:after="0"/>
       </w:pPr>
     </w:p>
     <w:p>
       <w:pPr>
         <w:pStyle w:val="Heading1"/>
+        <w:spacing w:before="0" w:after="160"/>
       </w:pPr>
       <w:r>
         <w:rPr>
@@ -5494,7 +5405,7 @@
     </w:p>
     <w:p>
       <w:pPr>
-        <w:spacing w:line="276" w:lineRule="auto" w:after="120"/>
+        <w:spacing w:line="276" w:lineRule="auto" w:before="40" w:after="120"/>
         <w:jc w:val="both"/>
       </w:pPr>
       <w:r>
@@ -5511,18 +5422,20 @@
     <w:p>
       <w:pPr>
         <w:pStyle w:val="Heading2"/>
+        <w:spacing w:before="280" w:after="120"/>
       </w:pPr>
       <w:r>
         <w:rPr>
           <w:rFonts w:ascii="Arial" w:hAnsi="Arial"/>
           <w:color w:val="3D5A80"/>
         </w:rPr>
-        <w:t>6.1 HMM Regime Detection</w:t>
+        <w:t>HMM Regime Detection</w:t>
       </w:r>
     </w:p>
     <w:p>
       <w:pPr>
         <w:pStyle w:val="Heading3"/>
+        <w:spacing w:before="200" w:after="80"/>
       </w:pPr>
       <w:r>
         <w:rPr>
@@ -5534,7 +5447,7 @@
     </w:p>
     <w:p>
       <w:pPr>
-        <w:spacing w:line="276" w:lineRule="auto" w:after="120"/>
+        <w:spacing w:line="276" w:lineRule="auto" w:before="40" w:after="120"/>
         <w:jc w:val="both"/>
       </w:pPr>
       <w:r>
@@ -5550,7 +5463,7 @@
     </w:p>
     <w:p>
       <w:pPr>
-        <w:spacing w:line="276" w:lineRule="auto" w:after="120"/>
+        <w:spacing w:line="276" w:lineRule="auto" w:before="40" w:after="120"/>
         <w:jc w:val="both"/>
       </w:pPr>
       <w:r>
@@ -5561,12 +5474,13 @@
           <w:color w:val="3C3C3C"/>
           <w:sz w:val="22"/>
         </w:rPr>
-        <w:t>A Hidden Markov Model formalizes this intuition. The observed data (OAS levels and changes) is generated by an underlying hidden process that switches between a finite number of states. We do not observe the state directly --- we infer it from the data.</w:t>
+        <w:t>A Hidden Markov Model formalizes this intuition. The observed data (OAS levels and changes) is generated by an underlying hidden process that switches between a finite number of states. The state is not directly observed the state directly --- it is inferred from the data.</w:t>
       </w:r>
     </w:p>
     <w:p>
       <w:pPr>
         <w:pStyle w:val="Heading3"/>
+        <w:spacing w:before="200" w:after="80"/>
       </w:pPr>
       <w:r>
         <w:rPr>
@@ -5578,7 +5492,7 @@
     </w:p>
     <w:p>
       <w:pPr>
-        <w:spacing w:line="276" w:lineRule="auto" w:after="120"/>
+        <w:spacing w:line="276" w:lineRule="auto" w:before="40" w:after="120"/>
         <w:jc w:val="both"/>
       </w:pPr>
       <w:r>
@@ -5594,7 +5508,7 @@
     </w:p>
     <w:p>
       <w:pPr>
-        <w:spacing w:line="276" w:lineRule="auto" w:after="120"/>
+        <w:spacing w:line="276" w:lineRule="auto" w:before="40" w:after="120"/>
         <w:jc w:val="both"/>
       </w:pPr>
       <w:r>
@@ -5620,7 +5534,7 @@
     </w:p>
     <w:p>
       <w:pPr>
-        <w:spacing w:before="160" w:after="160"/>
+        <w:spacing w:before="120" w:after="120"/>
         <w:jc w:val="center"/>
       </w:pPr>
       <w:r>
@@ -5636,7 +5550,7 @@
     </w:p>
     <w:p>
       <w:pPr>
-        <w:spacing w:line="276" w:lineRule="auto" w:after="120"/>
+        <w:spacing w:line="276" w:lineRule="auto" w:before="40" w:after="120"/>
         <w:jc w:val="both"/>
       </w:pPr>
       <w:r>
@@ -5652,7 +5566,7 @@
     </w:p>
     <w:p>
       <w:pPr>
-        <w:spacing w:line="276" w:lineRule="auto" w:after="120"/>
+        <w:spacing w:line="276" w:lineRule="auto" w:before="40" w:after="120"/>
         <w:jc w:val="both"/>
       </w:pPr>
       <w:r>
@@ -5678,7 +5592,7 @@
     </w:p>
     <w:p>
       <w:pPr>
-        <w:spacing w:before="160" w:after="160"/>
+        <w:spacing w:before="120" w:after="120"/>
         <w:jc w:val="center"/>
       </w:pPr>
       <w:r>
@@ -5694,7 +5608,7 @@
     </w:p>
     <w:p>
       <w:pPr>
-        <w:spacing w:line="276" w:lineRule="auto" w:after="120"/>
+        <w:spacing w:line="276" w:lineRule="auto" w:before="40" w:after="120"/>
         <w:jc w:val="both"/>
       </w:pPr>
       <w:r>
@@ -5710,7 +5624,7 @@
     </w:p>
     <w:p>
       <w:pPr>
-        <w:spacing w:line="276" w:lineRule="auto" w:after="120"/>
+        <w:spacing w:line="276" w:lineRule="auto" w:before="40" w:after="120"/>
         <w:jc w:val="both"/>
       </w:pPr>
       <w:r>
@@ -5736,7 +5650,7 @@
     </w:p>
     <w:p>
       <w:pPr>
-        <w:spacing w:before="160" w:after="160"/>
+        <w:spacing w:before="120" w:after="120"/>
         <w:jc w:val="center"/>
       </w:pPr>
       <w:r>
@@ -5747,12 +5661,12 @@
           <w:color w:val="1B2A4A"/>
           <w:sz w:val="22"/>
         </w:rPr>
-        <w:t>S^* = argmaxS_₁, \ₗdₒₜₛ, S_T P(S₁, ldots, ST | x₁, ldots, xT)</w:t>
+        <w:t>S^* = argmaxS_₁, …, S_T P(S₁, …, ST | x₁, …, xT)</w:t>
       </w:r>
     </w:p>
     <w:p>
       <w:pPr>
-        <w:spacing w:line="276" w:lineRule="auto" w:after="120"/>
+        <w:spacing w:line="276" w:lineRule="auto" w:before="40" w:after="120"/>
         <w:jc w:val="both"/>
       </w:pPr>
       <w:r>
@@ -5768,7 +5682,7 @@
     </w:p>
     <w:p>
       <w:pPr>
-        <w:spacing w:line="276" w:lineRule="auto" w:after="120"/>
+        <w:spacing w:line="276" w:lineRule="auto" w:before="40" w:after="120"/>
         <w:jc w:val="both"/>
       </w:pPr>
       <w:r>
@@ -5795,6 +5709,7 @@
     <w:p>
       <w:pPr>
         <w:pStyle w:val="Heading3"/>
+        <w:spacing w:before="200" w:after="80"/>
       </w:pPr>
       <w:r>
         <w:rPr>
@@ -6387,12 +6302,12 @@
     </w:tbl>
     <w:p>
       <w:pPr>
-        <w:spacing w:before="80" w:after="80"/>
+        <w:spacing w:before="40" w:after="80"/>
       </w:pPr>
     </w:p>
     <w:p>
       <w:pPr>
-        <w:spacing w:line="276" w:lineRule="auto" w:after="120"/>
+        <w:spacing w:line="276" w:lineRule="auto" w:before="40" w:after="120"/>
         <w:jc w:val="both"/>
       </w:pPr>
       <w:r>
@@ -6409,7 +6324,7 @@
     <w:p>
       <w:pPr>
         <w:pStyle w:val="ListBullet"/>
-        <w:spacing w:line="276" w:lineRule="auto"/>
+        <w:spacing w:line="276" w:lineRule="auto" w:after="60"/>
       </w:pPr>
       <w:r>
         <w:rPr>
@@ -6435,7 +6350,7 @@
     <w:p>
       <w:pPr>
         <w:pStyle w:val="ListBullet"/>
-        <w:spacing w:line="276" w:lineRule="auto"/>
+        <w:spacing w:line="276" w:lineRule="auto" w:after="60"/>
       </w:pPr>
       <w:r>
         <w:rPr>
@@ -6460,7 +6375,7 @@
     </w:p>
     <w:p>
       <w:pPr>
-        <w:spacing w:line="276" w:lineRule="auto" w:after="120"/>
+        <w:spacing w:line="276" w:lineRule="auto" w:before="40" w:after="120"/>
         <w:jc w:val="both"/>
       </w:pPr>
       <w:r>
@@ -6476,7 +6391,7 @@
     </w:p>
     <w:p>
       <w:pPr>
-        <w:spacing w:before="160" w:after="160"/>
+        <w:spacing w:before="120" w:after="120"/>
         <w:jc w:val="center"/>
       </w:pPr>
       <w:r>
@@ -6492,7 +6407,7 @@
     </w:p>
     <w:p>
       <w:pPr>
-        <w:spacing w:before="200" w:after="80" w:line="264" w:lineRule="auto"/>
+        <w:spacing w:before="240" w:after="60" w:line="264" w:lineRule="auto"/>
       </w:pPr>
       <w:r>
         <w:rPr>
@@ -6506,14 +6421,14 @@
     </w:p>
     <w:p>
       <w:pPr>
-        <w:spacing w:before="40"/>
+        <w:spacing w:before="40" w:after="200"/>
         <w:jc w:val="center"/>
       </w:pPr>
       <w:r>
         <w:drawing>
           <wp:inline xmlns:a="http://schemas.openxmlformats.org/drawingml/2006/main" xmlns:pic="http://schemas.openxmlformats.org/drawingml/2006/picture">
             <wp:extent cx="5943600" cy="3632200"/>
-            <wp:docPr id="6" name="Picture 6"/>
+            <wp:docPr id="7" name="Picture 7"/>
             <wp:cNvGraphicFramePr>
               <a:graphicFrameLocks noChangeAspect="1"/>
             </wp:cNvGraphicFramePr>
@@ -6525,7 +6440,7 @@
                     <pic:cNvPicPr/>
                   </pic:nvPicPr>
                   <pic:blipFill>
-                    <a:blip r:embed="rId10"/>
+                    <a:blip r:embed="rId11"/>
                     <a:stretch>
                       <a:fillRect/>
                     </a:stretch>
@@ -6542,21 +6457,6 @@
             </a:graphic>
           </wp:inline>
         </w:drawing>
-      </w:r>
-    </w:p>
-    <w:p>
-      <w:pPr>
-        <w:spacing w:before="40" w:after="160"/>
-        <w:jc w:val="left"/>
-      </w:pPr>
-      <w:r>
-        <w:rPr>
-          <w:rFonts w:ascii="Arial" w:hAnsi="Arial"/>
-          <w:i/>
-          <w:color w:val="3C3C3C"/>
-          <w:sz w:val="16"/>
-        </w:rPr>
-        <w:t>Source: FRED OAS data  |  Figure 2: HMM Regime Probabilities (FRED IG OAS)</w:t>
       </w:r>
     </w:p>
     <w:tbl>
@@ -6902,7 +6802,7 @@
                 <w:color w:val="3C3C3C"/>
                 <w:sz w:val="20"/>
               </w:rPr>
-              <w:t>199</w:t>
+              <w:t>294</w:t>
             </w:r>
           </w:p>
         </w:tc>
@@ -6925,7 +6825,7 @@
                 <w:color w:val="3C3C3C"/>
                 <w:sz w:val="20"/>
               </w:rPr>
-              <w:t>57.7</w:t>
+              <w:t>85.2</w:t>
             </w:r>
           </w:p>
         </w:tc>
@@ -6948,7 +6848,7 @@
                 <w:color w:val="3C3C3C"/>
                 <w:sz w:val="20"/>
               </w:rPr>
-              <w:t>108.0</w:t>
+              <w:t>132.0</w:t>
             </w:r>
           </w:p>
         </w:tc>
@@ -6971,7 +6871,7 @@
                 <w:color w:val="3C3C3C"/>
                 <w:sz w:val="20"/>
               </w:rPr>
-              <w:t>23.0</w:t>
+              <w:t>43.0</w:t>
             </w:r>
           </w:p>
         </w:tc>
@@ -6994,7 +6894,7 @@
                 <w:color w:val="3C3C3C"/>
                 <w:sz w:val="20"/>
               </w:rPr>
-              <w:t>-0.4</w:t>
+              <w:t>-0.3</w:t>
             </w:r>
           </w:p>
         </w:tc>
@@ -7040,7 +6940,7 @@
                 <w:color w:val="3C3C3C"/>
                 <w:sz w:val="20"/>
               </w:rPr>
-              <w:t>121</w:t>
+              <w:t>43</w:t>
             </w:r>
           </w:p>
         </w:tc>
@@ -7062,7 +6962,7 @@
                 <w:color w:val="3C3C3C"/>
                 <w:sz w:val="20"/>
               </w:rPr>
-              <w:t>35.1</w:t>
+              <w:t>12.5</w:t>
             </w:r>
           </w:p>
         </w:tc>
@@ -7084,7 +6984,7 @@
                 <w:color w:val="3C3C3C"/>
                 <w:sz w:val="20"/>
               </w:rPr>
-              <w:t>176.0</w:t>
+              <w:t>186.0</w:t>
             </w:r>
           </w:p>
         </w:tc>
@@ -7106,7 +7006,7 @@
                 <w:color w:val="3C3C3C"/>
                 <w:sz w:val="20"/>
               </w:rPr>
-              <w:t>49.0</w:t>
+              <w:t>90.0</w:t>
             </w:r>
           </w:p>
         </w:tc>
@@ -7128,7 +7028,7 @@
                 <w:color w:val="3C3C3C"/>
                 <w:sz w:val="20"/>
               </w:rPr>
-              <w:t>-3.1</w:t>
+              <w:t>-2.7</w:t>
             </w:r>
           </w:p>
         </w:tc>
@@ -7176,7 +7076,7 @@
                 <w:color w:val="3C3C3C"/>
                 <w:sz w:val="20"/>
               </w:rPr>
-              <w:t>25</w:t>
+              <w:t>8</w:t>
             </w:r>
           </w:p>
         </w:tc>
@@ -7199,7 +7099,7 @@
                 <w:color w:val="3C3C3C"/>
                 <w:sz w:val="20"/>
               </w:rPr>
-              <w:t>7.2</w:t>
+              <w:t>2.3</w:t>
             </w:r>
           </w:p>
         </w:tc>
@@ -7222,7 +7122,7 @@
                 <w:color w:val="3C3C3C"/>
                 <w:sz w:val="20"/>
               </w:rPr>
-              <w:t>335.0</w:t>
+              <w:t>529.0</w:t>
             </w:r>
           </w:p>
         </w:tc>
@@ -7245,7 +7145,7 @@
                 <w:color w:val="3C3C3C"/>
                 <w:sz w:val="20"/>
               </w:rPr>
-              <w:t>156.0</w:t>
+              <w:t>123.0</w:t>
             </w:r>
           </w:p>
         </w:tc>
@@ -7268,7 +7168,7 @@
                 <w:color w:val="3C3C3C"/>
                 <w:sz w:val="20"/>
               </w:rPr>
-              <w:t>19.4</w:t>
+              <w:t>28.6</w:t>
             </w:r>
           </w:p>
         </w:tc>
@@ -7681,6 +7581,7 @@
     <w:p>
       <w:pPr>
         <w:pStyle w:val="Heading3"/>
+        <w:spacing w:before="200" w:after="80"/>
       </w:pPr>
       <w:r>
         <w:rPr>
@@ -7693,7 +7594,7 @@
     <w:p>
       <w:pPr>
         <w:pStyle w:val="ListBullet"/>
-        <w:spacing w:line="276" w:lineRule="auto"/>
+        <w:spacing w:line="276" w:lineRule="auto" w:after="60"/>
       </w:pPr>
       <w:r>
         <w:rPr>
@@ -7719,7 +7620,7 @@
     <w:p>
       <w:pPr>
         <w:pStyle w:val="ListBullet"/>
-        <w:spacing w:line="276" w:lineRule="auto"/>
+        <w:spacing w:line="276" w:lineRule="auto" w:after="60"/>
       </w:pPr>
       <w:r>
         <w:rPr>
@@ -7745,7 +7646,7 @@
     <w:p>
       <w:pPr>
         <w:pStyle w:val="ListBullet"/>
-        <w:spacing w:line="276" w:lineRule="auto"/>
+        <w:spacing w:line="276" w:lineRule="auto" w:after="60"/>
       </w:pPr>
       <w:r>
         <w:rPr>
@@ -7791,6 +7692,7 @@
     <w:p>
       <w:pPr>
         <w:pStyle w:val="Heading3"/>
+        <w:spacing w:before="200" w:after="80"/>
       </w:pPr>
       <w:r>
         <w:rPr>
@@ -7818,7 +7720,7 @@
     </w:p>
     <w:p>
       <w:pPr>
-        <w:spacing w:line="276" w:lineRule="auto" w:after="120"/>
+        <w:spacing w:line="276" w:lineRule="auto" w:before="40" w:after="120"/>
         <w:jc w:val="both"/>
       </w:pPr>
       <w:r>
@@ -7875,18 +7777,20 @@
     <w:p>
       <w:pPr>
         <w:pStyle w:val="Heading2"/>
+        <w:spacing w:before="280" w:after="120"/>
       </w:pPr>
       <w:r>
         <w:rPr>
           <w:rFonts w:ascii="Arial" w:hAnsi="Arial"/>
           <w:color w:val="3D5A80"/>
         </w:rPr>
-        <w:t>6.2 Prophet OAS Forecasting</w:t>
+        <w:t>Prophet OAS Forecasting</w:t>
       </w:r>
     </w:p>
     <w:p>
       <w:pPr>
         <w:pStyle w:val="Heading3"/>
+        <w:spacing w:before="200" w:after="80"/>
       </w:pPr>
       <w:r>
         <w:rPr>
@@ -7898,7 +7802,7 @@
     </w:p>
     <w:p>
       <w:pPr>
-        <w:spacing w:line="276" w:lineRule="auto" w:after="120"/>
+        <w:spacing w:line="276" w:lineRule="auto" w:before="40" w:after="120"/>
         <w:jc w:val="both"/>
       </w:pPr>
       <w:r>
@@ -7955,6 +7859,7 @@
     <w:p>
       <w:pPr>
         <w:pStyle w:val="Heading3"/>
+        <w:spacing w:before="200" w:after="80"/>
       </w:pPr>
       <w:r>
         <w:rPr>
@@ -7966,7 +7871,7 @@
     </w:p>
     <w:p>
       <w:pPr>
-        <w:spacing w:line="276" w:lineRule="auto" w:after="120"/>
+        <w:spacing w:line="276" w:lineRule="auto" w:before="40" w:after="120"/>
         <w:jc w:val="both"/>
       </w:pPr>
       <w:r>
@@ -8002,7 +7907,7 @@
     </w:p>
     <w:p>
       <w:pPr>
-        <w:spacing w:before="160" w:after="160"/>
+        <w:spacing w:before="120" w:after="120"/>
         <w:jc w:val="center"/>
       </w:pPr>
       <w:r>
@@ -8018,7 +7923,7 @@
     </w:p>
     <w:p>
       <w:pPr>
-        <w:spacing w:line="276" w:lineRule="auto" w:after="120"/>
+        <w:spacing w:line="276" w:lineRule="auto" w:before="40" w:after="120"/>
         <w:jc w:val="both"/>
       </w:pPr>
       <w:r>
@@ -8035,7 +7940,7 @@
     <w:p>
       <w:pPr>
         <w:pStyle w:val="ListBullet"/>
-        <w:spacing w:line="276" w:lineRule="auto"/>
+        <w:spacing w:line="276" w:lineRule="auto" w:after="60"/>
       </w:pPr>
       <w:r>
         <w:rPr>
@@ -8051,7 +7956,7 @@
     <w:p>
       <w:pPr>
         <w:pStyle w:val="ListBullet"/>
-        <w:spacing w:line="276" w:lineRule="auto"/>
+        <w:spacing w:line="276" w:lineRule="auto" w:after="60"/>
       </w:pPr>
       <w:r>
         <w:rPr>
@@ -8067,7 +7972,7 @@
     <w:p>
       <w:pPr>
         <w:pStyle w:val="ListBullet"/>
-        <w:spacing w:line="276" w:lineRule="auto"/>
+        <w:spacing w:line="276" w:lineRule="auto" w:after="60"/>
       </w:pPr>
       <w:r>
         <w:rPr>
@@ -8083,6 +7988,7 @@
     <w:p>
       <w:pPr>
         <w:pStyle w:val="Heading3"/>
+        <w:spacing w:before="200" w:after="80"/>
       </w:pPr>
       <w:r>
         <w:rPr>
@@ -8094,7 +8000,7 @@
     </w:p>
     <w:p>
       <w:pPr>
-        <w:spacing w:line="276" w:lineRule="auto" w:after="120"/>
+        <w:spacing w:line="276" w:lineRule="auto" w:before="40" w:after="120"/>
         <w:jc w:val="both"/>
       </w:pPr>
       <w:r>
@@ -8110,7 +8016,7 @@
     </w:p>
     <w:p>
       <w:pPr>
-        <w:spacing w:before="160" w:after="160"/>
+        <w:spacing w:before="120" w:after="120"/>
         <w:jc w:val="center"/>
       </w:pPr>
       <w:r>
@@ -8126,7 +8032,7 @@
     </w:p>
     <w:p>
       <w:pPr>
-        <w:spacing w:line="276" w:lineRule="auto" w:after="120"/>
+        <w:spacing w:line="276" w:lineRule="auto" w:before="40" w:after="120"/>
         <w:jc w:val="both"/>
       </w:pPr>
       <w:r>
@@ -8143,7 +8049,7 @@
     <w:p>
       <w:pPr>
         <w:pStyle w:val="ListBullet"/>
-        <w:spacing w:line="276" w:lineRule="auto"/>
+        <w:spacing w:line="276" w:lineRule="auto" w:after="60"/>
       </w:pPr>
       <w:r>
         <w:rPr>
@@ -8179,7 +8085,7 @@
     <w:p>
       <w:pPr>
         <w:pStyle w:val="ListBullet"/>
-        <w:spacing w:line="276" w:lineRule="auto"/>
+        <w:spacing w:line="276" w:lineRule="auto" w:after="60"/>
       </w:pPr>
       <w:r>
         <w:rPr>
@@ -8215,6 +8121,7 @@
     <w:p>
       <w:pPr>
         <w:pStyle w:val="Heading3"/>
+        <w:spacing w:before="200" w:after="80"/>
       </w:pPr>
       <w:r>
         <w:rPr>
@@ -8226,7 +8133,7 @@
     </w:p>
     <w:p>
       <w:pPr>
-        <w:spacing w:line="276" w:lineRule="auto" w:after="120"/>
+        <w:spacing w:line="276" w:lineRule="auto" w:before="40" w:after="120"/>
         <w:jc w:val="both"/>
       </w:pPr>
       <w:r>
@@ -8672,7 +8579,7 @@
                 <w:color w:val="3C3C3C"/>
                 <w:sz w:val="20"/>
               </w:rPr>
-              <w:t>0.57</w:t>
+              <w:t>0.55</w:t>
             </w:r>
           </w:p>
         </w:tc>
@@ -8807,7 +8714,7 @@
                 <w:color w:val="3C3C3C"/>
                 <w:sz w:val="20"/>
               </w:rPr>
-              <w:t>0.74</w:t>
+              <w:t>0.71</w:t>
             </w:r>
           </w:p>
         </w:tc>
@@ -8946,7 +8853,7 @@
                 <w:color w:val="3C3C3C"/>
                 <w:sz w:val="20"/>
               </w:rPr>
-              <w:t>0.92</w:t>
+              <w:t>0.90</w:t>
             </w:r>
           </w:p>
         </w:tc>
@@ -9081,7 +8988,7 @@
                 <w:color w:val="3C3C3C"/>
                 <w:sz w:val="20"/>
               </w:rPr>
-              <w:t>1.10</w:t>
+              <w:t>1.13</w:t>
             </w:r>
           </w:p>
         </w:tc>
@@ -9220,7 +9127,7 @@
                 <w:color w:val="3C3C3C"/>
                 <w:sz w:val="20"/>
               </w:rPr>
-              <w:t>2.89</w:t>
+              <w:t>3.00</w:t>
             </w:r>
           </w:p>
         </w:tc>
@@ -9256,7 +9163,7 @@
     </w:p>
     <w:p>
       <w:pPr>
-        <w:spacing w:before="200" w:after="80" w:line="264" w:lineRule="auto"/>
+        <w:spacing w:before="240" w:after="60" w:line="264" w:lineRule="auto"/>
       </w:pPr>
       <w:r>
         <w:rPr>
@@ -9270,76 +9177,7 @@
     </w:p>
     <w:p>
       <w:pPr>
-        <w:spacing w:before="40"/>
-        <w:jc w:val="center"/>
-      </w:pPr>
-      <w:r>
-        <w:drawing>
-          <wp:inline xmlns:a="http://schemas.openxmlformats.org/drawingml/2006/main" xmlns:pic="http://schemas.openxmlformats.org/drawingml/2006/picture">
-            <wp:extent cx="5943600" cy="3632200"/>
-            <wp:docPr id="7" name="Picture 7"/>
-            <wp:cNvGraphicFramePr>
-              <a:graphicFrameLocks noChangeAspect="1"/>
-            </wp:cNvGraphicFramePr>
-            <a:graphic>
-              <a:graphicData uri="http://schemas.openxmlformats.org/drawingml/2006/picture">
-                <pic:pic>
-                  <pic:nvPicPr>
-                    <pic:cNvPr id="0" name="fig_4399318144.png"/>
-                    <pic:cNvPicPr/>
-                  </pic:nvPicPr>
-                  <pic:blipFill>
-                    <a:blip r:embed="rId14"/>
-                    <a:stretch>
-                      <a:fillRect/>
-                    </a:stretch>
-                  </pic:blipFill>
-                  <pic:spPr>
-                    <a:xfrm>
-                      <a:off x="0" y="0"/>
-                      <a:ext cx="5943600" cy="3632200"/>
-                    </a:xfrm>
-                    <a:prstGeom prst="rect"/>
-                  </pic:spPr>
-                </pic:pic>
-              </a:graphicData>
-            </a:graphic>
-          </wp:inline>
-        </w:drawing>
-      </w:r>
-    </w:p>
-    <w:p>
-      <w:pPr>
-        <w:spacing w:before="40" w:after="160"/>
-        <w:jc w:val="left"/>
-      </w:pPr>
-      <w:r>
-        <w:rPr>
-          <w:rFonts w:ascii="Arial" w:hAnsi="Arial"/>
-          <w:i/>
-          <w:color w:val="3C3C3C"/>
-          <w:sz w:val="16"/>
-        </w:rPr>
-        <w:t>Source: FRED OAS data  |  Figure 4: Current vs 3-Month Forecast OAS (FRED)</w:t>
-      </w:r>
-    </w:p>
-    <w:p>
-      <w:pPr>
-        <w:spacing w:before="200" w:after="80" w:line="264" w:lineRule="auto"/>
-      </w:pPr>
-      <w:r>
-        <w:rPr>
-          <w:rFonts w:ascii="Arial" w:hAnsi="Arial"/>
-          <w:b/>
-          <w:color w:val="1B2A4A"/>
-          <w:sz w:val="20"/>
-        </w:rPr>
-        <w:t>Forecast spread direction aligns with subsequent realized moves</w:t>
-      </w:r>
-    </w:p>
-    <w:p>
-      <w:pPr>
-        <w:spacing w:before="40"/>
+        <w:spacing w:before="40" w:after="200"/>
         <w:jc w:val="center"/>
       </w:pPr>
       <w:r>
@@ -9354,7 +9192,7 @@
               <a:graphicData uri="http://schemas.openxmlformats.org/drawingml/2006/picture">
                 <pic:pic>
                   <pic:nvPicPr>
-                    <pic:cNvPr id="0" name="fig_4399367680.png"/>
+                    <pic:cNvPr id="0" name="fig_4436110656.png"/>
                     <pic:cNvPicPr/>
                   </pic:nvPicPr>
                   <pic:blipFill>
@@ -9379,34 +9217,75 @@
     </w:p>
     <w:p>
       <w:pPr>
-        <w:spacing w:before="40" w:after="160"/>
-        <w:jc w:val="left"/>
+        <w:spacing w:before="240" w:after="60" w:line="264" w:lineRule="auto"/>
       </w:pPr>
       <w:r>
         <w:rPr>
           <w:rFonts w:ascii="Arial" w:hAnsi="Arial"/>
-          <w:i/>
-          <w:color w:val="3C3C3C"/>
-          <w:sz w:val="16"/>
+          <w:b/>
+          <w:color w:val="1B2A4A"/>
+          <w:sz w:val="20"/>
         </w:rPr>
-        <w:t>Source: FRED OAS data  |  Figure 5: Forecast Spread Direction (Green = Tightening, Red = Widening)</w:t>
+        <w:t>Forecast spread direction aligns with subsequent realized moves</w:t>
       </w:r>
     </w:p>
     <w:p>
       <w:pPr>
+        <w:spacing w:before="40" w:after="200"/>
+        <w:jc w:val="center"/>
+      </w:pPr>
+      <w:r>
+        <w:drawing>
+          <wp:inline xmlns:a="http://schemas.openxmlformats.org/drawingml/2006/main" xmlns:pic="http://schemas.openxmlformats.org/drawingml/2006/picture">
+            <wp:extent cx="5943600" cy="3632200"/>
+            <wp:docPr id="9" name="Picture 9"/>
+            <wp:cNvGraphicFramePr>
+              <a:graphicFrameLocks noChangeAspect="1"/>
+            </wp:cNvGraphicFramePr>
+            <a:graphic>
+              <a:graphicData uri="http://schemas.openxmlformats.org/drawingml/2006/picture">
+                <pic:pic>
+                  <pic:nvPicPr>
+                    <pic:cNvPr id="0" name="fig_4436143808.png"/>
+                    <pic:cNvPicPr/>
+                  </pic:nvPicPr>
+                  <pic:blipFill>
+                    <a:blip r:embed="rId16"/>
+                    <a:stretch>
+                      <a:fillRect/>
+                    </a:stretch>
+                  </pic:blipFill>
+                  <pic:spPr>
+                    <a:xfrm>
+                      <a:off x="0" y="0"/>
+                      <a:ext cx="5943600" cy="3632200"/>
+                    </a:xfrm>
+                    <a:prstGeom prst="rect"/>
+                  </pic:spPr>
+                </pic:pic>
+              </a:graphicData>
+            </a:graphic>
+          </wp:inline>
+        </w:drawing>
+      </w:r>
+    </w:p>
+    <w:p>
+      <w:pPr>
         <w:pStyle w:val="Heading2"/>
+        <w:spacing w:before="280" w:after="120"/>
       </w:pPr>
       <w:r>
         <w:rPr>
           <w:rFonts w:ascii="Arial" w:hAnsi="Arial"/>
           <w:color w:val="3D5A80"/>
         </w:rPr>
-        <w:t>6.3 Black-Litterman Return Estimation</w:t>
+        <w:t>Black-Litterman Return Estimation</w:t>
       </w:r>
     </w:p>
     <w:p>
       <w:pPr>
         <w:pStyle w:val="Heading3"/>
+        <w:spacing w:before="200" w:after="80"/>
       </w:pPr>
       <w:r>
         <w:rPr>
@@ -9418,7 +9297,7 @@
     </w:p>
     <w:p>
       <w:pPr>
-        <w:spacing w:line="276" w:lineRule="auto" w:after="120"/>
+        <w:spacing w:line="276" w:lineRule="auto" w:before="40" w:after="120"/>
         <w:jc w:val="both"/>
       </w:pPr>
       <w:r>
@@ -9454,7 +9333,7 @@
     </w:p>
     <w:p>
       <w:pPr>
-        <w:spacing w:line="276" w:lineRule="auto" w:after="120"/>
+        <w:spacing w:line="276" w:lineRule="auto" w:before="40" w:after="120"/>
         <w:jc w:val="both"/>
       </w:pPr>
       <w:r>
@@ -9471,6 +9350,7 @@
     <w:p>
       <w:pPr>
         <w:pStyle w:val="Heading3"/>
+        <w:spacing w:before="200" w:after="80"/>
       </w:pPr>
       <w:r>
         <w:rPr>
@@ -9482,7 +9362,7 @@
     </w:p>
     <w:p>
       <w:pPr>
-        <w:spacing w:line="276" w:lineRule="auto" w:after="120"/>
+        <w:spacing w:line="276" w:lineRule="auto" w:before="40" w:after="120"/>
         <w:jc w:val="both"/>
       </w:pPr>
       <w:r>
@@ -9498,7 +9378,7 @@
     </w:p>
     <w:p>
       <w:pPr>
-        <w:spacing w:before="160" w:after="160"/>
+        <w:spacing w:before="120" w:after="120"/>
         <w:jc w:val="center"/>
       </w:pPr>
       <w:r>
@@ -9514,7 +9394,7 @@
     </w:p>
     <w:p>
       <w:pPr>
-        <w:spacing w:line="276" w:lineRule="auto" w:after="120"/>
+        <w:spacing w:line="276" w:lineRule="auto" w:before="40" w:after="120"/>
         <w:jc w:val="both"/>
       </w:pPr>
       <w:r>
@@ -9531,7 +9411,7 @@
     <w:p>
       <w:pPr>
         <w:pStyle w:val="ListBullet"/>
-        <w:spacing w:line="276" w:lineRule="auto"/>
+        <w:spacing w:line="276" w:lineRule="auto" w:after="60"/>
       </w:pPr>
       <w:r>
         <w:rPr>
@@ -9547,7 +9427,7 @@
     <w:p>
       <w:pPr>
         <w:pStyle w:val="ListBullet"/>
-        <w:spacing w:line="276" w:lineRule="auto"/>
+        <w:spacing w:line="276" w:lineRule="auto" w:after="60"/>
       </w:pPr>
       <w:r>
         <w:rPr>
@@ -9563,7 +9443,7 @@
     <w:p>
       <w:pPr>
         <w:pStyle w:val="ListBullet"/>
-        <w:spacing w:line="276" w:lineRule="auto"/>
+        <w:spacing w:line="276" w:lineRule="auto" w:after="60"/>
       </w:pPr>
       <w:r>
         <w:rPr>
@@ -9578,7 +9458,7 @@
     </w:p>
     <w:p>
       <w:pPr>
-        <w:spacing w:line="276" w:lineRule="auto" w:after="120"/>
+        <w:spacing w:line="276" w:lineRule="auto" w:before="40" w:after="120"/>
         <w:jc w:val="both"/>
       </w:pPr>
       <w:r>
@@ -9594,7 +9474,7 @@
     </w:p>
     <w:p>
       <w:pPr>
-        <w:spacing w:before="160" w:after="160"/>
+        <w:spacing w:before="120" w:after="120"/>
         <w:jc w:val="center"/>
       </w:pPr>
       <w:r>
@@ -9610,7 +9490,7 @@
     </w:p>
     <w:p>
       <w:pPr>
-        <w:spacing w:before="160" w:after="160"/>
+        <w:spacing w:before="120" w:after="120"/>
         <w:jc w:val="center"/>
       </w:pPr>
       <w:r>
@@ -9626,7 +9506,7 @@
     </w:p>
     <w:p>
       <w:pPr>
-        <w:spacing w:line="276" w:lineRule="auto" w:after="120"/>
+        <w:spacing w:line="276" w:lineRule="auto" w:before="40" w:after="120"/>
         <w:jc w:val="both"/>
       </w:pPr>
       <w:r>
@@ -9642,7 +9522,7 @@
     </w:p>
     <w:p>
       <w:pPr>
-        <w:spacing w:before="160" w:after="160"/>
+        <w:spacing w:before="120" w:after="120"/>
         <w:jc w:val="center"/>
       </w:pPr>
       <w:r>
@@ -9658,7 +9538,7 @@
     </w:p>
     <w:p>
       <w:pPr>
-        <w:spacing w:line="276" w:lineRule="auto" w:after="120"/>
+        <w:spacing w:line="276" w:lineRule="auto" w:before="40" w:after="120"/>
         <w:jc w:val="both"/>
       </w:pPr>
       <w:r>
@@ -9675,7 +9555,7 @@
     <w:p>
       <w:pPr>
         <w:pStyle w:val="ListBullet"/>
-        <w:spacing w:line="276" w:lineRule="auto"/>
+        <w:spacing w:line="276" w:lineRule="auto" w:after="60"/>
       </w:pPr>
       <w:r>
         <w:rPr>
@@ -9691,7 +9571,7 @@
     <w:p>
       <w:pPr>
         <w:pStyle w:val="ListBullet"/>
-        <w:spacing w:line="276" w:lineRule="auto"/>
+        <w:spacing w:line="276" w:lineRule="auto" w:after="60"/>
       </w:pPr>
       <w:r>
         <w:rPr>
@@ -9707,6 +9587,7 @@
     <w:p>
       <w:pPr>
         <w:pStyle w:val="Heading3"/>
+        <w:spacing w:before="200" w:after="80"/>
       </w:pPr>
       <w:r>
         <w:rPr>
@@ -10113,12 +9994,13 @@
     </w:tbl>
     <w:p>
       <w:pPr>
-        <w:spacing w:before="80" w:after="80"/>
+        <w:spacing w:before="40" w:after="80"/>
       </w:pPr>
     </w:p>
     <w:p>
       <w:pPr>
         <w:pStyle w:val="Heading3"/>
+        <w:spacing w:before="200" w:after="80"/>
       </w:pPr>
       <w:r>
         <w:rPr>
@@ -10131,7 +10013,7 @@
     <w:p>
       <w:pPr>
         <w:pStyle w:val="ListBullet"/>
-        <w:spacing w:line="276" w:lineRule="auto"/>
+        <w:spacing w:line="276" w:lineRule="auto" w:after="60"/>
       </w:pPr>
       <w:r>
         <w:rPr>
@@ -10157,7 +10039,7 @@
     <w:p>
       <w:pPr>
         <w:pStyle w:val="ListBullet"/>
-        <w:spacing w:line="276" w:lineRule="auto"/>
+        <w:spacing w:line="276" w:lineRule="auto" w:after="60"/>
       </w:pPr>
       <w:r>
         <w:rPr>
@@ -10183,7 +10065,7 @@
     <w:p>
       <w:pPr>
         <w:pStyle w:val="ListBullet"/>
-        <w:spacing w:line="276" w:lineRule="auto"/>
+        <w:spacing w:line="276" w:lineRule="auto" w:after="60"/>
       </w:pPr>
       <w:r>
         <w:rPr>
@@ -10209,7 +10091,7 @@
     <w:p>
       <w:pPr>
         <w:pStyle w:val="ListBullet"/>
-        <w:spacing w:line="276" w:lineRule="auto"/>
+        <w:spacing w:line="276" w:lineRule="auto" w:after="60"/>
       </w:pPr>
       <w:r>
         <w:rPr>
@@ -10234,7 +10116,7 @@
     </w:p>
     <w:p>
       <w:pPr>
-        <w:spacing w:before="200" w:after="80" w:line="264" w:lineRule="auto"/>
+        <w:spacing w:before="240" w:after="60" w:line="264" w:lineRule="auto"/>
       </w:pPr>
       <w:r>
         <w:rPr>
@@ -10248,14 +10130,14 @@
     </w:p>
     <w:p>
       <w:pPr>
-        <w:spacing w:before="40"/>
+        <w:spacing w:before="40" w:after="200"/>
         <w:jc w:val="center"/>
       </w:pPr>
       <w:r>
         <w:drawing>
           <wp:inline xmlns:a="http://schemas.openxmlformats.org/drawingml/2006/main" xmlns:pic="http://schemas.openxmlformats.org/drawingml/2006/picture">
             <wp:extent cx="5943600" cy="3632200"/>
-            <wp:docPr id="9" name="Picture 9"/>
+            <wp:docPr id="10" name="Picture 10"/>
             <wp:cNvGraphicFramePr>
               <a:graphicFrameLocks noChangeAspect="1"/>
             </wp:cNvGraphicFramePr>
@@ -10263,11 +10145,11 @@
               <a:graphicData uri="http://schemas.openxmlformats.org/drawingml/2006/picture">
                 <pic:pic>
                   <pic:nvPicPr>
-                    <pic:cNvPr id="0" name="fig_4399434304.png"/>
+                    <pic:cNvPr id="0" name="fig_4436177664.png"/>
                     <pic:cNvPicPr/>
                   </pic:nvPicPr>
                   <pic:blipFill>
-                    <a:blip r:embed="rId16"/>
+                    <a:blip r:embed="rId17"/>
                     <a:stretch>
                       <a:fillRect/>
                     </a:stretch>
@@ -10288,22 +10170,8 @@
     </w:p>
     <w:p>
       <w:pPr>
-        <w:spacing w:before="40" w:after="160"/>
-        <w:jc w:val="left"/>
-      </w:pPr>
-      <w:r>
-        <w:rPr>
-          <w:rFonts w:ascii="Arial" w:hAnsi="Arial"/>
-          <w:i/>
-          <w:color w:val="3C3C3C"/>
-          <w:sz w:val="16"/>
-        </w:rPr>
-        <w:t>Source: FRED OAS data  |  Figure 3: Black-Litterman Return Estimates (FRED Data)</w:t>
-      </w:r>
-    </w:p>
-    <w:p>
-      <w:pPr>
         <w:pStyle w:val="Heading3"/>
+        <w:spacing w:before="200" w:after="80"/>
       </w:pPr>
       <w:r>
         <w:rPr>
@@ -10316,7 +10184,7 @@
     <w:p>
       <w:pPr>
         <w:pStyle w:val="ListBullet"/>
-        <w:spacing w:line="276" w:lineRule="auto"/>
+        <w:spacing w:line="276" w:lineRule="auto" w:after="60"/>
       </w:pPr>
       <w:r>
         <w:rPr>
@@ -10362,7 +10230,7 @@
     <w:p>
       <w:pPr>
         <w:pStyle w:val="ListBullet"/>
-        <w:spacing w:line="276" w:lineRule="auto"/>
+        <w:spacing w:line="276" w:lineRule="auto" w:after="60"/>
       </w:pPr>
       <w:r>
         <w:rPr>
@@ -10408,7 +10276,7 @@
     <w:p>
       <w:pPr>
         <w:pStyle w:val="ListBullet"/>
-        <w:spacing w:line="276" w:lineRule="auto"/>
+        <w:spacing w:line="276" w:lineRule="auto" w:after="60"/>
       </w:pPr>
       <w:r>
         <w:rPr>
@@ -10434,18 +10302,20 @@
     <w:p>
       <w:pPr>
         <w:pStyle w:val="Heading2"/>
+        <w:spacing w:before="280" w:after="120"/>
       </w:pPr>
       <w:r>
         <w:rPr>
           <w:rFonts w:ascii="Arial" w:hAnsi="Arial"/>
           <w:color w:val="3D5A80"/>
         </w:rPr>
-        <w:t>6.4 Credit Factor Construction</w:t>
+        <w:t>Credit Factor Construction</w:t>
       </w:r>
     </w:p>
     <w:p>
       <w:pPr>
         <w:pStyle w:val="Heading3"/>
+        <w:spacing w:before="200" w:after="80"/>
       </w:pPr>
       <w:r>
         <w:rPr>
@@ -10457,7 +10327,7 @@
     </w:p>
     <w:p>
       <w:pPr>
-        <w:spacing w:line="276" w:lineRule="auto" w:after="120"/>
+        <w:spacing w:line="276" w:lineRule="auto" w:before="40" w:after="120"/>
         <w:jc w:val="both"/>
       </w:pPr>
       <w:r>
@@ -10961,12 +10831,13 @@
     </w:tbl>
     <w:p>
       <w:pPr>
-        <w:spacing w:before="80" w:after="80"/>
+        <w:spacing w:before="40" w:after="80"/>
       </w:pPr>
     </w:p>
     <w:p>
       <w:pPr>
         <w:pStyle w:val="Heading3"/>
+        <w:spacing w:before="200" w:after="80"/>
       </w:pPr>
       <w:r>
         <w:rPr>
@@ -10978,7 +10849,7 @@
     </w:p>
     <w:p>
       <w:pPr>
-        <w:spacing w:line="276" w:lineRule="auto" w:after="120"/>
+        <w:spacing w:line="276" w:lineRule="auto" w:before="40" w:after="120"/>
         <w:jc w:val="both"/>
       </w:pPr>
       <w:r>
@@ -10995,7 +10866,7 @@
     <w:p>
       <w:pPr>
         <w:pStyle w:val="ListBullet"/>
-        <w:spacing w:line="276" w:lineRule="auto"/>
+        <w:spacing w:line="276" w:lineRule="auto" w:after="60"/>
       </w:pPr>
       <w:r>
         <w:rPr>
@@ -11041,7 +10912,7 @@
     <w:p>
       <w:pPr>
         <w:pStyle w:val="ListBullet"/>
-        <w:spacing w:line="276" w:lineRule="auto"/>
+        <w:spacing w:line="276" w:lineRule="auto" w:after="60"/>
       </w:pPr>
       <w:r>
         <w:rPr>
@@ -11067,7 +10938,7 @@
     <w:p>
       <w:pPr>
         <w:pStyle w:val="ListBullet"/>
-        <w:spacing w:line="276" w:lineRule="auto"/>
+        <w:spacing w:line="276" w:lineRule="auto" w:after="60"/>
       </w:pPr>
       <w:r>
         <w:rPr>
@@ -11092,7 +10963,7 @@
     </w:p>
     <w:p>
       <w:pPr>
-        <w:spacing w:line="276" w:lineRule="auto" w:after="120"/>
+        <w:spacing w:line="276" w:lineRule="auto" w:before="40" w:after="120"/>
         <w:jc w:val="both"/>
       </w:pPr>
       <w:r>
@@ -11109,6 +10980,7 @@
     <w:p>
       <w:pPr>
         <w:pStyle w:val="Heading3"/>
+        <w:spacing w:before="200" w:after="80"/>
       </w:pPr>
       <w:r>
         <w:rPr>
@@ -11120,7 +10992,7 @@
     </w:p>
     <w:p>
       <w:pPr>
-        <w:spacing w:line="276" w:lineRule="auto" w:after="120"/>
+        <w:spacing w:line="276" w:lineRule="auto" w:before="40" w:after="120"/>
         <w:jc w:val="both"/>
       </w:pPr>
       <w:r>
@@ -11136,7 +11008,7 @@
     </w:p>
     <w:p>
       <w:pPr>
-        <w:spacing w:before="160" w:after="160"/>
+        <w:spacing w:before="120" w:after="120"/>
         <w:jc w:val="center"/>
       </w:pPr>
       <w:r>
@@ -11152,7 +11024,7 @@
     </w:p>
     <w:p>
       <w:pPr>
-        <w:spacing w:line="276" w:lineRule="auto" w:after="120"/>
+        <w:spacing w:line="276" w:lineRule="auto" w:before="40" w:after="120"/>
         <w:jc w:val="both"/>
       </w:pPr>
       <w:r>
@@ -11168,7 +11040,7 @@
     </w:p>
     <w:p>
       <w:pPr>
-        <w:spacing w:before="160" w:after="160"/>
+        <w:spacing w:before="120" w:after="120"/>
         <w:jc w:val="center"/>
       </w:pPr>
       <w:r>
@@ -11184,7 +11056,7 @@
     </w:p>
     <w:p>
       <w:pPr>
-        <w:spacing w:line="276" w:lineRule="auto" w:after="120"/>
+        <w:spacing w:line="276" w:lineRule="auto" w:before="40" w:after="120"/>
         <w:jc w:val="both"/>
       </w:pPr>
       <w:r>
@@ -11200,12 +11072,13 @@
     </w:p>
     <w:p>
       <w:pPr>
-        <w:spacing w:before="360" w:after="0"/>
+        <w:spacing w:before="400" w:after="0"/>
       </w:pPr>
     </w:p>
     <w:p>
       <w:pPr>
         <w:pStyle w:val="Heading1"/>
+        <w:spacing w:before="0" w:after="160"/>
       </w:pPr>
       <w:r>
         <w:rPr>
@@ -11218,6 +11091,7 @@
     <w:p>
       <w:pPr>
         <w:pStyle w:val="Heading3"/>
+        <w:spacing w:before="200" w:after="80"/>
       </w:pPr>
       <w:r>
         <w:rPr>
@@ -11229,7 +11103,7 @@
     </w:p>
     <w:p>
       <w:pPr>
-        <w:spacing w:line="276" w:lineRule="auto" w:after="120"/>
+        <w:spacing w:line="276" w:lineRule="auto" w:before="40" w:after="120"/>
         <w:jc w:val="both"/>
       </w:pPr>
       <w:r>
@@ -12035,19 +11909,20 @@
     </w:tbl>
     <w:p>
       <w:pPr>
-        <w:spacing w:before="80" w:after="80"/>
+        <w:spacing w:before="40" w:after="80"/>
       </w:pPr>
     </w:p>
     <w:p>
       <w:pPr>
         <w:pStyle w:val="Heading3"/>
+        <w:spacing w:before="200" w:after="80"/>
       </w:pPr>
       <w:r>
         <w:rPr>
           <w:rFonts w:ascii="Arial" w:hAnsi="Arial"/>
           <w:color w:val="1B2A4A"/>
         </w:rPr>
-        <w:t>What We Measure</w:t>
+        <w:t>Performance Metrics</w:t>
       </w:r>
     </w:p>
     <w:tbl>
@@ -12493,25 +12368,26 @@
     </w:tbl>
     <w:p>
       <w:pPr>
-        <w:spacing w:before="80" w:after="80"/>
+        <w:spacing w:before="40" w:after="80"/>
       </w:pPr>
     </w:p>
     <w:p>
       <w:pPr>
         <w:pStyle w:val="Heading3"/>
+        <w:spacing w:before="200" w:after="80"/>
       </w:pPr>
       <w:r>
         <w:rPr>
           <w:rFonts w:ascii="Arial" w:hAnsi="Arial"/>
           <w:color w:val="1B2A4A"/>
         </w:rPr>
-        <w:t>What We Do NOT Do</w:t>
+        <w:t>Methodological Constraints</w:t>
       </w:r>
     </w:p>
     <w:p>
       <w:pPr>
         <w:pStyle w:val="ListBullet"/>
-        <w:spacing w:line="276" w:lineRule="auto"/>
+        <w:spacing w:line="276" w:lineRule="auto" w:after="60"/>
       </w:pPr>
       <w:r>
         <w:rPr>
@@ -12537,7 +12413,7 @@
     <w:p>
       <w:pPr>
         <w:pStyle w:val="ListBullet"/>
-        <w:spacing w:line="276" w:lineRule="auto"/>
+        <w:spacing w:line="276" w:lineRule="auto" w:after="60"/>
       </w:pPr>
       <w:r>
         <w:rPr>
@@ -12563,7 +12439,7 @@
     <w:p>
       <w:pPr>
         <w:pStyle w:val="ListBullet"/>
-        <w:spacing w:line="276" w:lineRule="auto"/>
+        <w:spacing w:line="276" w:lineRule="auto" w:after="60"/>
       </w:pPr>
       <w:r>
         <w:rPr>
@@ -12589,7 +12465,7 @@
     <w:p>
       <w:pPr>
         <w:pStyle w:val="ListBullet"/>
-        <w:spacing w:line="276" w:lineRule="auto"/>
+        <w:spacing w:line="276" w:lineRule="auto" w:after="60"/>
       </w:pPr>
       <w:r>
         <w:rPr>
@@ -12599,7 +12475,7 @@
           <w:color w:val="3C3C3C"/>
           <w:sz w:val="22"/>
         </w:rPr>
-        <w:t>Signals use only past data.</w:t>
+        <w:t>No look-ahead.</w:t>
       </w:r>
       <w:r>
         <w:rPr>
@@ -12609,17 +12485,18 @@
           <w:color w:val="3C3C3C"/>
           <w:sz w:val="22"/>
         </w:rPr>
-        <w:t xml:space="preserve"> Factor signals at time t use only data available at time t. Prophet is refit at each rebalance. The HMM is fitted on the full sample --- a mild form of look-ahead on the regime parameters only (not the allocation signals). This is standard in academic backtests and noted as a limitation in Section 10.</w:t>
+        <w:t xml:space="preserve"> The HMM uses expanding-window estimation, refitted every 12 months on all past data. Signals at time t use only data available at t. Prophet is refit at each rebalance using only past data.</w:t>
       </w:r>
     </w:p>
     <w:p>
       <w:pPr>
-        <w:spacing w:before="360" w:after="0"/>
+        <w:spacing w:before="400" w:after="0"/>
       </w:pPr>
     </w:p>
     <w:p>
       <w:pPr>
         <w:pStyle w:val="Heading1"/>
+        <w:spacing w:before="0" w:after="160"/>
       </w:pPr>
       <w:r>
         <w:rPr>
@@ -12632,6 +12509,7 @@
     <w:p>
       <w:pPr>
         <w:pStyle w:val="Heading3"/>
+        <w:spacing w:before="200" w:after="80"/>
       </w:pPr>
       <w:r>
         <w:rPr>
@@ -12643,7 +12521,7 @@
     </w:p>
     <w:p>
       <w:pPr>
-        <w:spacing w:line="276" w:lineRule="auto" w:after="120"/>
+        <w:spacing w:line="276" w:lineRule="auto" w:before="40" w:after="120"/>
         <w:jc w:val="both"/>
       </w:pPr>
       <w:r>
@@ -12659,7 +12537,7 @@
     </w:p>
     <w:p>
       <w:pPr>
-        <w:spacing w:line="276" w:lineRule="auto" w:after="120"/>
+        <w:spacing w:line="276" w:lineRule="auto" w:before="40" w:after="120"/>
         <w:jc w:val="both"/>
       </w:pPr>
       <w:r>
@@ -12675,7 +12553,7 @@
     </w:p>
     <w:p>
       <w:pPr>
-        <w:spacing w:before="200" w:after="80" w:line="264" w:lineRule="auto"/>
+        <w:spacing w:before="240" w:after="60" w:line="264" w:lineRule="auto"/>
       </w:pPr>
       <w:r>
         <w:rPr>
@@ -12689,14 +12567,14 @@
     </w:p>
     <w:p>
       <w:pPr>
-        <w:spacing w:before="40"/>
+        <w:spacing w:before="40" w:after="200"/>
         <w:jc w:val="center"/>
       </w:pPr>
       <w:r>
         <w:drawing>
           <wp:inline xmlns:a="http://schemas.openxmlformats.org/drawingml/2006/main" xmlns:pic="http://schemas.openxmlformats.org/drawingml/2006/picture">
             <wp:extent cx="5943600" cy="3632200"/>
-            <wp:docPr id="10" name="Picture 10"/>
+            <wp:docPr id="11" name="Picture 11"/>
             <wp:cNvGraphicFramePr>
               <a:graphicFrameLocks noChangeAspect="1"/>
             </wp:cNvGraphicFramePr>
@@ -12708,7 +12586,7 @@
                     <pic:cNvPicPr/>
                   </pic:nvPicPr>
                   <pic:blipFill>
-                    <a:blip r:embed="rId9"/>
+                    <a:blip r:embed="rId10"/>
                     <a:stretch>
                       <a:fillRect/>
                     </a:stretch>
@@ -12725,21 +12603,6 @@
             </a:graphic>
           </wp:inline>
         </w:drawing>
-      </w:r>
-    </w:p>
-    <w:p>
-      <w:pPr>
-        <w:spacing w:before="40" w:after="160"/>
-        <w:jc w:val="left"/>
-      </w:pPr>
-      <w:r>
-        <w:rPr>
-          <w:rFonts w:ascii="Arial" w:hAnsi="Arial"/>
-          <w:i/>
-          <w:color w:val="3C3C3C"/>
-          <w:sz w:val="16"/>
-        </w:rPr>
-        <w:t>Source: FRED OAS data  |  Figure 6: Cumulative Returns — Factor Strategy vs Benchmark (FRED)</w:t>
       </w:r>
     </w:p>
     <w:tbl>
@@ -13743,7 +13606,7 @@
     </w:p>
     <w:p>
       <w:pPr>
-        <w:spacing w:before="200" w:after="80" w:line="264" w:lineRule="auto"/>
+        <w:spacing w:before="240" w:after="60" w:line="264" w:lineRule="auto"/>
       </w:pPr>
       <w:r>
         <w:rPr>
@@ -13757,14 +13620,14 @@
     </w:p>
     <w:p>
       <w:pPr>
-        <w:spacing w:before="40"/>
+        <w:spacing w:before="40" w:after="200"/>
         <w:jc w:val="center"/>
       </w:pPr>
       <w:r>
         <w:drawing>
           <wp:inline xmlns:a="http://schemas.openxmlformats.org/drawingml/2006/main" xmlns:pic="http://schemas.openxmlformats.org/drawingml/2006/picture">
             <wp:extent cx="5943600" cy="3632200"/>
-            <wp:docPr id="11" name="Picture 11"/>
+            <wp:docPr id="12" name="Picture 12"/>
             <wp:cNvGraphicFramePr>
               <a:graphicFrameLocks noChangeAspect="1"/>
             </wp:cNvGraphicFramePr>
@@ -13772,11 +13635,11 @@
               <a:graphicData uri="http://schemas.openxmlformats.org/drawingml/2006/picture">
                 <pic:pic>
                   <pic:nvPicPr>
-                    <pic:cNvPr id="0" name="fig_4399574464.png"/>
+                    <pic:cNvPr id="0" name="fig_4436383488.png"/>
                     <pic:cNvPicPr/>
                   </pic:nvPicPr>
                   <pic:blipFill>
-                    <a:blip r:embed="rId17"/>
+                    <a:blip r:embed="rId18"/>
                     <a:stretch>
                       <a:fillRect/>
                     </a:stretch>
@@ -13797,22 +13660,7 @@
     </w:p>
     <w:p>
       <w:pPr>
-        <w:spacing w:before="40" w:after="160"/>
-        <w:jc w:val="left"/>
-      </w:pPr>
-      <w:r>
-        <w:rPr>
-          <w:rFonts w:ascii="Arial" w:hAnsi="Arial"/>
-          <w:i/>
-          <w:color w:val="3C3C3C"/>
-          <w:sz w:val="16"/>
-        </w:rPr>
-        <w:t>Source: FRED OAS data  |  Figure 7: Credit Factor Signals by Rating Bucket (FRED)</w:t>
-      </w:r>
-    </w:p>
-    <w:p>
-      <w:pPr>
-        <w:spacing w:before="200" w:after="80" w:line="264" w:lineRule="auto"/>
+        <w:spacing w:before="240" w:after="60" w:line="264" w:lineRule="auto"/>
       </w:pPr>
       <w:r>
         <w:rPr>
@@ -13826,14 +13674,14 @@
     </w:p>
     <w:p>
       <w:pPr>
-        <w:spacing w:before="40"/>
+        <w:spacing w:before="40" w:after="200"/>
         <w:jc w:val="center"/>
       </w:pPr>
       <w:r>
         <w:drawing>
           <wp:inline xmlns:a="http://schemas.openxmlformats.org/drawingml/2006/main" xmlns:pic="http://schemas.openxmlformats.org/drawingml/2006/picture">
             <wp:extent cx="5943600" cy="3632200"/>
-            <wp:docPr id="12" name="Picture 12"/>
+            <wp:docPr id="13" name="Picture 13"/>
             <wp:cNvGraphicFramePr>
               <a:graphicFrameLocks noChangeAspect="1"/>
             </wp:cNvGraphicFramePr>
@@ -13845,7 +13693,7 @@
                     <pic:cNvPicPr/>
                   </pic:nvPicPr>
                   <pic:blipFill>
-                    <a:blip r:embed="rId11"/>
+                    <a:blip r:embed="rId12"/>
                     <a:stretch>
                       <a:fillRect/>
                     </a:stretch>
@@ -13866,22 +13714,8 @@
     </w:p>
     <w:p>
       <w:pPr>
-        <w:spacing w:before="40" w:after="160"/>
-        <w:jc w:val="left"/>
-      </w:pPr>
-      <w:r>
-        <w:rPr>
-          <w:rFonts w:ascii="Arial" w:hAnsi="Arial"/>
-          <w:i/>
-          <w:color w:val="3C3C3C"/>
-          <w:sz w:val="16"/>
-        </w:rPr>
-        <w:t>Source: FRED OAS data  |  Figure 8: Rating Bucket Allocation Over Time</w:t>
-      </w:r>
-    </w:p>
-    <w:p>
-      <w:pPr>
         <w:pStyle w:val="Heading3"/>
+        <w:spacing w:before="200" w:after="80"/>
       </w:pPr>
       <w:r>
         <w:rPr>
@@ -13893,7 +13727,7 @@
     </w:p>
     <w:p>
       <w:pPr>
-        <w:spacing w:line="276" w:lineRule="auto" w:after="120"/>
+        <w:spacing w:line="276" w:lineRule="auto" w:before="40" w:after="120"/>
         <w:jc w:val="both"/>
       </w:pPr>
       <w:r>
@@ -13909,7 +13743,7 @@
     </w:p>
     <w:p>
       <w:pPr>
-        <w:spacing w:line="276" w:lineRule="auto" w:after="120"/>
+        <w:spacing w:line="276" w:lineRule="auto" w:before="40" w:after="120"/>
         <w:jc w:val="both"/>
       </w:pPr>
       <w:r>
@@ -13926,7 +13760,7 @@
     <w:p>
       <w:pPr>
         <w:pStyle w:val="ListBullet"/>
-        <w:spacing w:line="276" w:lineRule="auto"/>
+        <w:spacing w:line="276" w:lineRule="auto" w:after="60"/>
       </w:pPr>
       <w:r>
         <w:rPr>
@@ -13962,7 +13796,7 @@
     <w:p>
       <w:pPr>
         <w:pStyle w:val="ListBullet"/>
-        <w:spacing w:line="276" w:lineRule="auto"/>
+        <w:spacing w:line="276" w:lineRule="auto" w:after="60"/>
       </w:pPr>
       <w:r>
         <w:rPr>
@@ -13998,7 +13832,7 @@
     <w:p>
       <w:pPr>
         <w:pStyle w:val="ListBullet"/>
-        <w:spacing w:line="276" w:lineRule="auto"/>
+        <w:spacing w:line="276" w:lineRule="auto" w:after="60"/>
       </w:pPr>
       <w:r>
         <w:rPr>
@@ -14023,7 +13857,7 @@
     </w:p>
     <w:p>
       <w:pPr>
-        <w:spacing w:line="276" w:lineRule="auto" w:after="120"/>
+        <w:spacing w:line="276" w:lineRule="auto" w:before="40" w:after="120"/>
         <w:jc w:val="both"/>
       </w:pPr>
       <w:r>
@@ -14040,7 +13874,7 @@
     <w:p>
       <w:pPr>
         <w:pStyle w:val="ListBullet"/>
-        <w:spacing w:line="276" w:lineRule="auto"/>
+        <w:spacing w:line="276" w:lineRule="auto" w:after="60"/>
       </w:pPr>
       <w:r>
         <w:rPr>
@@ -14056,7 +13890,7 @@
     <w:p>
       <w:pPr>
         <w:pStyle w:val="ListBullet"/>
-        <w:spacing w:line="276" w:lineRule="auto"/>
+        <w:spacing w:line="276" w:lineRule="auto" w:after="60"/>
       </w:pPr>
       <w:r>
         <w:rPr>
@@ -14072,7 +13906,7 @@
     <w:p>
       <w:pPr>
         <w:pStyle w:val="ListBullet"/>
-        <w:spacing w:line="276" w:lineRule="auto"/>
+        <w:spacing w:line="276" w:lineRule="auto" w:after="60"/>
       </w:pPr>
       <w:r>
         <w:rPr>
@@ -14088,7 +13922,7 @@
     <w:p>
       <w:pPr>
         <w:pStyle w:val="ListBullet"/>
-        <w:spacing w:line="276" w:lineRule="auto"/>
+        <w:spacing w:line="276" w:lineRule="auto" w:after="60"/>
       </w:pPr>
       <w:r>
         <w:rPr>
@@ -14103,7 +13937,7 @@
     </w:p>
     <w:p>
       <w:pPr>
-        <w:spacing w:line="276" w:lineRule="auto" w:after="120"/>
+        <w:spacing w:line="276" w:lineRule="auto" w:before="40" w:after="120"/>
         <w:jc w:val="both"/>
       </w:pPr>
       <w:r>
@@ -14119,12 +13953,13 @@
     </w:p>
     <w:p>
       <w:pPr>
-        <w:spacing w:before="360" w:after="0"/>
+        <w:spacing w:before="400" w:after="0"/>
       </w:pPr>
     </w:p>
     <w:p>
       <w:pPr>
         <w:pStyle w:val="Heading1"/>
+        <w:spacing w:before="0" w:after="160"/>
       </w:pPr>
       <w:r>
         <w:rPr>
@@ -14136,7 +13971,7 @@
     </w:p>
     <w:p>
       <w:pPr>
-        <w:spacing w:line="276" w:lineRule="auto" w:after="120"/>
+        <w:spacing w:line="276" w:lineRule="auto" w:before="40" w:after="120"/>
         <w:jc w:val="both"/>
       </w:pPr>
       <w:r>
@@ -14193,18 +14028,20 @@
     <w:p>
       <w:pPr>
         <w:pStyle w:val="Heading2"/>
+        <w:spacing w:before="280" w:after="120"/>
       </w:pPr>
       <w:r>
         <w:rPr>
           <w:rFonts w:ascii="Arial" w:hAnsi="Arial"/>
           <w:color w:val="3D5A80"/>
         </w:rPr>
-        <w:t>9.1 Stress Testing</w:t>
+        <w:t>Stress Testing</w:t>
       </w:r>
     </w:p>
     <w:p>
       <w:pPr>
         <w:pStyle w:val="Heading3"/>
+        <w:spacing w:before="200" w:after="80"/>
       </w:pPr>
       <w:r>
         <w:rPr>
@@ -14216,7 +14053,7 @@
     </w:p>
     <w:p>
       <w:pPr>
-        <w:spacing w:line="276" w:lineRule="auto" w:after="120"/>
+        <w:spacing w:line="276" w:lineRule="auto" w:before="40" w:after="120"/>
         <w:jc w:val="both"/>
       </w:pPr>
       <w:r>
@@ -14252,7 +14089,7 @@
     </w:p>
     <w:p>
       <w:pPr>
-        <w:spacing w:line="276" w:lineRule="auto" w:after="120"/>
+        <w:spacing w:line="276" w:lineRule="auto" w:before="40" w:after="120"/>
         <w:jc w:val="both"/>
       </w:pPr>
       <w:r>
@@ -14989,12 +14826,12 @@
     </w:tbl>
     <w:p>
       <w:pPr>
-        <w:spacing w:before="80" w:after="80"/>
+        <w:spacing w:before="40" w:after="80"/>
       </w:pPr>
     </w:p>
     <w:p>
       <w:pPr>
-        <w:spacing w:line="276" w:lineRule="auto" w:after="120"/>
+        <w:spacing w:line="276" w:lineRule="auto" w:before="40" w:after="120"/>
         <w:jc w:val="both"/>
       </w:pPr>
       <w:r>
@@ -16138,7 +15975,7 @@
     </w:p>
     <w:p>
       <w:pPr>
-        <w:spacing w:before="200" w:after="80" w:line="264" w:lineRule="auto"/>
+        <w:spacing w:before="240" w:after="60" w:line="264" w:lineRule="auto"/>
       </w:pPr>
       <w:r>
         <w:rPr>
@@ -16152,76 +15989,7 @@
     </w:p>
     <w:p>
       <w:pPr>
-        <w:spacing w:before="40"/>
-        <w:jc w:val="center"/>
-      </w:pPr>
-      <w:r>
-        <w:drawing>
-          <wp:inline xmlns:a="http://schemas.openxmlformats.org/drawingml/2006/main" xmlns:pic="http://schemas.openxmlformats.org/drawingml/2006/picture">
-            <wp:extent cx="5943600" cy="3632200"/>
-            <wp:docPr id="13" name="Picture 13"/>
-            <wp:cNvGraphicFramePr>
-              <a:graphicFrameLocks noChangeAspect="1"/>
-            </wp:cNvGraphicFramePr>
-            <a:graphic>
-              <a:graphicData uri="http://schemas.openxmlformats.org/drawingml/2006/picture">
-                <pic:pic>
-                  <pic:nvPicPr>
-                    <pic:cNvPr id="0" name="fig_4400142784.png"/>
-                    <pic:cNvPicPr/>
-                  </pic:nvPicPr>
-                  <pic:blipFill>
-                    <a:blip r:embed="rId18"/>
-                    <a:stretch>
-                      <a:fillRect/>
-                    </a:stretch>
-                  </pic:blipFill>
-                  <pic:spPr>
-                    <a:xfrm>
-                      <a:off x="0" y="0"/>
-                      <a:ext cx="5943600" cy="3632200"/>
-                    </a:xfrm>
-                    <a:prstGeom prst="rect"/>
-                  </pic:spPr>
-                </pic:pic>
-              </a:graphicData>
-            </a:graphic>
-          </wp:inline>
-        </w:drawing>
-      </w:r>
-    </w:p>
-    <w:p>
-      <w:pPr>
-        <w:spacing w:before="40" w:after="160"/>
-        <w:jc w:val="left"/>
-      </w:pPr>
-      <w:r>
-        <w:rPr>
-          <w:rFonts w:ascii="Arial" w:hAnsi="Arial"/>
-          <w:i/>
-          <w:color w:val="3C3C3C"/>
-          <w:sz w:val="16"/>
-        </w:rPr>
-        <w:t>Source: FRED OAS data  |  Figure 9: Price Impact by Scenario and Rating Bucket</w:t>
-      </w:r>
-    </w:p>
-    <w:p>
-      <w:pPr>
-        <w:spacing w:before="200" w:after="80" w:line="264" w:lineRule="auto"/>
-      </w:pPr>
-      <w:r>
-        <w:rPr>
-          <w:rFonts w:ascii="Arial" w:hAnsi="Arial"/>
-          <w:b/>
-          <w:color w:val="1B2A4A"/>
-          <w:sz w:val="20"/>
-        </w:rPr>
-        <w:t>Stressed OAS levels remain within historically observed ranges across all scenarios</w:t>
-      </w:r>
-    </w:p>
-    <w:p>
-      <w:pPr>
-        <w:spacing w:before="40"/>
+        <w:spacing w:before="40" w:after="200"/>
         <w:jc w:val="center"/>
       </w:pPr>
       <w:r>
@@ -16236,7 +16004,7 @@
               <a:graphicData uri="http://schemas.openxmlformats.org/drawingml/2006/picture">
                 <pic:pic>
                   <pic:nvPicPr>
-                    <pic:cNvPr id="0" name="fig_4400209664.png"/>
+                    <pic:cNvPr id="0" name="fig_4437000960.png"/>
                     <pic:cNvPicPr/>
                   </pic:nvPicPr>
                   <pic:blipFill>
@@ -16261,485 +16029,7 @@
     </w:p>
     <w:p>
       <w:pPr>
-        <w:spacing w:before="40" w:after="160"/>
-        <w:jc w:val="left"/>
-      </w:pPr>
-      <w:r>
-        <w:rPr>
-          <w:rFonts w:ascii="Arial" w:hAnsi="Arial"/>
-          <w:i/>
-          <w:color w:val="3C3C3C"/>
-          <w:sz w:val="16"/>
-        </w:rPr>
-        <w:t>Source: FRED OAS data  |  Figure 10: OAS Levels — Baseline vs Stressed (All Scenarios)</w:t>
-      </w:r>
-    </w:p>
-    <w:p>
-      <w:pPr>
-        <w:pStyle w:val="Heading2"/>
-      </w:pPr>
-      <w:r>
-        <w:rPr>
-          <w:rFonts w:ascii="Arial" w:hAnsi="Arial"/>
-          <w:color w:val="3D5A80"/>
-        </w:rPr>
-        <w:t>9.2 Monte Carlo Simulation</w:t>
-      </w:r>
-    </w:p>
-    <w:p>
-      <w:pPr>
-        <w:pStyle w:val="Heading3"/>
-      </w:pPr>
-      <w:r>
-        <w:rPr>
-          <w:rFonts w:ascii="Arial" w:hAnsi="Arial"/>
-          <w:color w:val="1B2A4A"/>
-        </w:rPr>
-        <w:t>Purpose</w:t>
-      </w:r>
-    </w:p>
-    <w:p>
-      <w:pPr>
-        <w:spacing w:line="276" w:lineRule="auto" w:after="120"/>
-        <w:jc w:val="both"/>
-      </w:pPr>
-      <w:r>
-        <w:rPr>
-          <w:rFonts w:ascii="Arial" w:hAnsi="Arial"/>
-          <w:b w:val="0"/>
-          <w:i w:val="0"/>
-          <w:color w:val="3C3C3C"/>
-          <w:sz w:val="22"/>
-        </w:rPr>
-        <w:t xml:space="preserve">Unlike the backtest (which tells us what </w:t>
-      </w:r>
-      <w:r>
-        <w:rPr>
-          <w:rFonts w:ascii="Arial" w:hAnsi="Arial"/>
-          <w:b w:val="0"/>
-          <w:i/>
-          <w:color w:val="3C3C3C"/>
-          <w:sz w:val="22"/>
-        </w:rPr>
-        <w:t>did</w:t>
-      </w:r>
-      <w:r>
-        <w:rPr>
-          <w:rFonts w:ascii="Arial" w:hAnsi="Arial"/>
-          <w:b w:val="0"/>
-          <w:i w:val="0"/>
-          <w:color w:val="3C3C3C"/>
-          <w:sz w:val="22"/>
-        </w:rPr>
-        <w:t xml:space="preserve"> happen), Monte Carlo tells us what </w:t>
-      </w:r>
-      <w:r>
-        <w:rPr>
-          <w:rFonts w:ascii="Arial" w:hAnsi="Arial"/>
-          <w:b w:val="0"/>
-          <w:i/>
-          <w:color w:val="3C3C3C"/>
-          <w:sz w:val="22"/>
-        </w:rPr>
-        <w:t>could</w:t>
-      </w:r>
-      <w:r>
-        <w:rPr>
-          <w:rFonts w:ascii="Arial" w:hAnsi="Arial"/>
-          <w:b w:val="0"/>
-          <w:i w:val="0"/>
-          <w:color w:val="3C3C3C"/>
-          <w:sz w:val="22"/>
-        </w:rPr>
-        <w:t xml:space="preserve"> happen by resampling from the actual return distribution. This quantifies forward-looking risk.</w:t>
-      </w:r>
-    </w:p>
-    <w:p>
-      <w:pPr>
-        <w:pStyle w:val="Heading3"/>
-      </w:pPr>
-      <w:r>
-        <w:rPr>
-          <w:rFonts w:ascii="Arial" w:hAnsi="Arial"/>
-          <w:color w:val="1B2A4A"/>
-        </w:rPr>
-        <w:t>Methodology</w:t>
-      </w:r>
-    </w:p>
-    <w:p>
-      <w:pPr>
-        <w:spacing w:line="276" w:lineRule="auto" w:after="120"/>
-        <w:jc w:val="both"/>
-      </w:pPr>
-      <w:r>
-        <w:rPr>
-          <w:rFonts w:ascii="Arial" w:hAnsi="Arial"/>
-          <w:b w:val="0"/>
-          <w:i w:val="0"/>
-          <w:color w:val="3C3C3C"/>
-          <w:sz w:val="22"/>
-        </w:rPr>
-        <w:t xml:space="preserve">We use </w:t>
-      </w:r>
-      <w:r>
-        <w:rPr>
-          <w:rFonts w:ascii="Arial" w:hAnsi="Arial"/>
-          <w:b/>
-          <w:i w:val="0"/>
-          <w:color w:val="3C3C3C"/>
-          <w:sz w:val="22"/>
-        </w:rPr>
-        <w:t>empirical bootstrap resampling</w:t>
-      </w:r>
-      <w:r>
-        <w:rPr>
-          <w:rFonts w:ascii="Arial" w:hAnsi="Arial"/>
-          <w:b w:val="0"/>
-          <w:i w:val="0"/>
-          <w:color w:val="3C3C3C"/>
-          <w:sz w:val="22"/>
-        </w:rPr>
-        <w:t>: sample monthly returns with replacement from the actual backtest history (5,000 simulations, 24-month horizon). This preserves the real return distribution including skewness and fat tails --- unlike parametric simulation, which assumes normality and underestimates tail risk.</w:t>
-      </w:r>
-    </w:p>
-    <w:p>
-      <w:pPr>
-        <w:pStyle w:val="Heading3"/>
-      </w:pPr>
-      <w:r>
-        <w:rPr>
-          <w:rFonts w:ascii="Arial" w:hAnsi="Arial"/>
-          <w:color w:val="1B2A4A"/>
-        </w:rPr>
-        <w:t>Key Risk Metrics</w:t>
-      </w:r>
-    </w:p>
-    <w:tbl>
-      <w:tblPr>
-        <w:tblStyle w:val="TableGrid"/>
-        <w:tblW w:type="auto" w:w="0"/>
-        <w:jc w:val="center"/>
-        <w:tblLook w:firstColumn="1" w:firstRow="1" w:lastColumn="0" w:lastRow="0" w:noHBand="0" w:noVBand="1" w:val="04A0"/>
-        <w:tblBorders>
-          <w:top w:val="single" w:sz="4" w:space="0" w:color="1B2A4A"/>
-          <w:bottom w:val="single" w:sz="4" w:space="0" w:color="1B2A4A"/>
-          <w:insideH w:val="single" w:sz="2" w:space="0" w:color="CCCCCC"/>
-        </w:tblBorders>
-      </w:tblPr>
-      <w:tblGrid>
-        <w:gridCol w:w="3120"/>
-        <w:gridCol w:w="3120"/>
-        <w:gridCol w:w="3120"/>
-      </w:tblGrid>
-      <w:tr>
-        <w:tc>
-          <w:tcPr>
-            <w:tcW w:type="dxa" w:w="3120"/>
-            <w:shd w:fill="1B2A4A" w:val="clear"/>
-          </w:tcPr>
-          <w:p>
-            <w:r>
-              <w:rPr>
-                <w:rFonts w:ascii="Arial" w:hAnsi="Arial"/>
-                <w:b/>
-                <w:color w:val="FFFFFF"/>
-                <w:sz w:val="20"/>
-              </w:rPr>
-            </w:r>
-            <w:r>
-              <w:rPr>
-                <w:rFonts w:ascii="Arial" w:hAnsi="Arial"/>
-                <w:b/>
-                <w:color w:val="FFFFFF"/>
-                <w:sz w:val="20"/>
-              </w:rPr>
-              <w:t>Metric</w:t>
-            </w:r>
-          </w:p>
-        </w:tc>
-        <w:tc>
-          <w:tcPr>
-            <w:tcW w:type="dxa" w:w="3120"/>
-            <w:shd w:fill="1B2A4A" w:val="clear"/>
-          </w:tcPr>
-          <w:p>
-            <w:r>
-              <w:rPr>
-                <w:rFonts w:ascii="Arial" w:hAnsi="Arial"/>
-                <w:b/>
-                <w:color w:val="FFFFFF"/>
-                <w:sz w:val="20"/>
-              </w:rPr>
-            </w:r>
-            <w:r>
-              <w:rPr>
-                <w:rFonts w:ascii="Arial" w:hAnsi="Arial"/>
-                <w:b/>
-                <w:color w:val="FFFFFF"/>
-                <w:sz w:val="20"/>
-              </w:rPr>
-              <w:t>Definition</w:t>
-            </w:r>
-          </w:p>
-        </w:tc>
-        <w:tc>
-          <w:tcPr>
-            <w:tcW w:type="dxa" w:w="3120"/>
-            <w:shd w:fill="1B2A4A" w:val="clear"/>
-          </w:tcPr>
-          <w:p>
-            <w:r>
-              <w:rPr>
-                <w:rFonts w:ascii="Arial" w:hAnsi="Arial"/>
-                <w:b/>
-                <w:color w:val="FFFFFF"/>
-                <w:sz w:val="20"/>
-              </w:rPr>
-            </w:r>
-            <w:r>
-              <w:rPr>
-                <w:rFonts w:ascii="Arial" w:hAnsi="Arial"/>
-                <w:b/>
-                <w:color w:val="FFFFFF"/>
-                <w:sz w:val="20"/>
-              </w:rPr>
-              <w:t>Interpretation</w:t>
-            </w:r>
-          </w:p>
-        </w:tc>
-      </w:tr>
-      <w:tr>
-        <w:tc>
-          <w:tcPr>
-            <w:tcW w:type="dxa" w:w="3120"/>
-          </w:tcPr>
-          <w:p>
-            <w:r>
-              <w:rPr>
-                <w:rFonts w:ascii="Arial" w:hAnsi="Arial"/>
-                <w:color w:val="3C3C3C"/>
-                <w:sz w:val="20"/>
-              </w:rPr>
-            </w:r>
-            <w:r>
-              <w:rPr>
-                <w:rFonts w:ascii="Arial" w:hAnsi="Arial"/>
-                <w:color w:val="3C3C3C"/>
-                <w:sz w:val="20"/>
-              </w:rPr>
-              <w:t>VaR (Value at Risk)</w:t>
-            </w:r>
-          </w:p>
-        </w:tc>
-        <w:tc>
-          <w:tcPr>
-            <w:tcW w:type="dxa" w:w="3120"/>
-          </w:tcPr>
-          <w:p>
-            <w:r>
-              <w:rPr>
-                <w:rFonts w:ascii="Arial" w:hAnsi="Arial"/>
-                <w:color w:val="3C3C3C"/>
-                <w:sz w:val="20"/>
-              </w:rPr>
-            </w:r>
-            <w:r>
-              <w:rPr>
-                <w:rFonts w:ascii="Arial" w:hAnsi="Arial"/>
-                <w:color w:val="3C3C3C"/>
-                <w:sz w:val="20"/>
-              </w:rPr>
-              <w:t>Loss threshold at a given confidence level</w:t>
-            </w:r>
-          </w:p>
-        </w:tc>
-        <w:tc>
-          <w:tcPr>
-            <w:tcW w:type="dxa" w:w="3120"/>
-          </w:tcPr>
-          <w:p>
-            <w:r>
-              <w:rPr>
-                <w:rFonts w:ascii="Arial" w:hAnsi="Arial"/>
-                <w:color w:val="3C3C3C"/>
-                <w:sz w:val="20"/>
-              </w:rPr>
-            </w:r>
-            <w:r>
-              <w:rPr>
-                <w:rFonts w:ascii="Arial" w:hAnsi="Arial"/>
-                <w:color w:val="3C3C3C"/>
-                <w:sz w:val="20"/>
-              </w:rPr>
-              <w:t>"There is a 5% chance of losing more than X%"</w:t>
-            </w:r>
-          </w:p>
-        </w:tc>
-      </w:tr>
-      <w:tr>
-        <w:tc>
-          <w:tcPr>
-            <w:tcW w:type="dxa" w:w="3120"/>
-            <w:shd w:fill="F2F2F2" w:val="clear"/>
-          </w:tcPr>
-          <w:p>
-            <w:r>
-              <w:rPr>
-                <w:rFonts w:ascii="Arial" w:hAnsi="Arial"/>
-                <w:color w:val="3C3C3C"/>
-                <w:sz w:val="20"/>
-              </w:rPr>
-            </w:r>
-            <w:r>
-              <w:rPr>
-                <w:rFonts w:ascii="Arial" w:hAnsi="Arial"/>
-                <w:color w:val="3C3C3C"/>
-                <w:sz w:val="20"/>
-              </w:rPr>
-              <w:t>CVaR (Conditional VaR)</w:t>
-            </w:r>
-          </w:p>
-        </w:tc>
-        <w:tc>
-          <w:tcPr>
-            <w:tcW w:type="dxa" w:w="3120"/>
-            <w:shd w:fill="F2F2F2" w:val="clear"/>
-          </w:tcPr>
-          <w:p>
-            <w:r>
-              <w:rPr>
-                <w:rFonts w:ascii="Arial" w:hAnsi="Arial"/>
-                <w:color w:val="3C3C3C"/>
-                <w:sz w:val="20"/>
-              </w:rPr>
-            </w:r>
-            <w:r>
-              <w:rPr>
-                <w:rFonts w:ascii="Arial" w:hAnsi="Arial"/>
-                <w:color w:val="3C3C3C"/>
-                <w:sz w:val="20"/>
-              </w:rPr>
-              <w:t>Average loss when VaR is breached</w:t>
-            </w:r>
-          </w:p>
-        </w:tc>
-        <w:tc>
-          <w:tcPr>
-            <w:tcW w:type="dxa" w:w="3120"/>
-            <w:shd w:fill="F2F2F2" w:val="clear"/>
-          </w:tcPr>
-          <w:p>
-            <w:r>
-              <w:rPr>
-                <w:rFonts w:ascii="Arial" w:hAnsi="Arial"/>
-                <w:color w:val="3C3C3C"/>
-                <w:sz w:val="20"/>
-              </w:rPr>
-            </w:r>
-            <w:r>
-              <w:rPr>
-                <w:rFonts w:ascii="Arial" w:hAnsi="Arial"/>
-                <w:color w:val="3C3C3C"/>
-                <w:sz w:val="20"/>
-              </w:rPr>
-              <w:t>"When things go wrong, on average we lose Y%" --- captures tail severity</w:t>
-            </w:r>
-          </w:p>
-        </w:tc>
-      </w:tr>
-      <w:tr>
-        <w:tc>
-          <w:tcPr>
-            <w:tcW w:type="dxa" w:w="3120"/>
-          </w:tcPr>
-          <w:p>
-            <w:r>
-              <w:rPr>
-                <w:rFonts w:ascii="Arial" w:hAnsi="Arial"/>
-                <w:color w:val="3C3C3C"/>
-                <w:sz w:val="20"/>
-              </w:rPr>
-            </w:r>
-            <w:r>
-              <w:rPr>
-                <w:rFonts w:ascii="Arial" w:hAnsi="Arial"/>
-                <w:color w:val="3C3C3C"/>
-                <w:sz w:val="20"/>
-              </w:rPr>
-              <w:t>P(Loss)</w:t>
-            </w:r>
-          </w:p>
-        </w:tc>
-        <w:tc>
-          <w:tcPr>
-            <w:tcW w:type="dxa" w:w="3120"/>
-          </w:tcPr>
-          <w:p>
-            <w:r>
-              <w:rPr>
-                <w:rFonts w:ascii="Arial" w:hAnsi="Arial"/>
-                <w:color w:val="3C3C3C"/>
-                <w:sz w:val="20"/>
-              </w:rPr>
-            </w:r>
-            <w:r>
-              <w:rPr>
-                <w:rFonts w:ascii="Arial" w:hAnsi="Arial"/>
-                <w:color w:val="3C3C3C"/>
-                <w:sz w:val="20"/>
-              </w:rPr>
-              <w:t>Probability of negative cumulative return over horizon</w:t>
-            </w:r>
-          </w:p>
-        </w:tc>
-        <w:tc>
-          <w:tcPr>
-            <w:tcW w:type="dxa" w:w="3120"/>
-          </w:tcPr>
-          <w:p>
-            <w:r>
-              <w:rPr>
-                <w:rFonts w:ascii="Arial" w:hAnsi="Arial"/>
-                <w:color w:val="3C3C3C"/>
-                <w:sz w:val="20"/>
-              </w:rPr>
-            </w:r>
-            <w:r>
-              <w:rPr>
-                <w:rFonts w:ascii="Arial" w:hAnsi="Arial"/>
-                <w:color w:val="3C3C3C"/>
-                <w:sz w:val="20"/>
-              </w:rPr>
-              <w:t>"What is the probability we are underwater at the end?"</w:t>
-            </w:r>
-          </w:p>
-        </w:tc>
-      </w:tr>
-    </w:tbl>
-    <w:p>
-      <w:pPr>
-        <w:spacing w:before="80" w:after="80"/>
-      </w:pPr>
-    </w:p>
-    <w:p>
-      <w:pPr>
-        <w:spacing w:line="276" w:lineRule="auto" w:after="120"/>
-        <w:jc w:val="both"/>
-      </w:pPr>
-      <w:r>
-        <w:rPr>
-          <w:rFonts w:ascii="Arial" w:hAnsi="Arial"/>
-          <w:b w:val="0"/>
-          <w:i w:val="0"/>
-          <w:color w:val="3C3C3C"/>
-          <w:sz w:val="22"/>
-        </w:rPr>
-        <w:t>The fan chart below shows the distribution of simulated cumulative return paths. The dark band is the interquartile range (25th--75th percentile); the light band is the 5th--95th percentile. The median path represents the central tendency under historical return dynamics.</w:t>
-      </w:r>
-    </w:p>
-    <w:p>
-      <w:pPr>
-        <w:spacing w:before="200" w:after="80" w:line="264" w:lineRule="auto"/>
+        <w:spacing w:before="240" w:after="60" w:line="264" w:lineRule="auto"/>
       </w:pPr>
       <w:r>
         <w:rPr>
@@ -16748,12 +16038,12 @@
           <w:color w:val="1B2A4A"/>
           <w:sz w:val="20"/>
         </w:rPr>
-        <w:t>Monte Carlo simulations show positive expected return with bounded downside over 24 months</w:t>
+        <w:t>Stressed OAS levels remain within historically observed ranges across all scenarios</w:t>
       </w:r>
     </w:p>
     <w:p>
       <w:pPr>
-        <w:spacing w:before="40"/>
+        <w:spacing w:before="40" w:after="200"/>
         <w:jc w:val="center"/>
       </w:pPr>
       <w:r>
@@ -16768,7 +16058,7 @@
               <a:graphicData uri="http://schemas.openxmlformats.org/drawingml/2006/picture">
                 <pic:pic>
                   <pic:nvPicPr>
-                    <pic:cNvPr id="0" name="fig_4400279488.png"/>
+                    <pic:cNvPr id="0" name="fig_4437067840.png"/>
                     <pic:cNvPicPr/>
                   </pic:nvPicPr>
                   <pic:blipFill>
@@ -16793,22 +16083,474 @@
     </w:p>
     <w:p>
       <w:pPr>
-        <w:spacing w:before="40" w:after="160"/>
-        <w:jc w:val="left"/>
+        <w:pStyle w:val="Heading2"/>
+        <w:spacing w:before="280" w:after="120"/>
       </w:pPr>
       <w:r>
         <w:rPr>
           <w:rFonts w:ascii="Arial" w:hAnsi="Arial"/>
+          <w:color w:val="3D5A80"/>
+        </w:rPr>
+        <w:t>Monte Carlo Simulation</w:t>
+      </w:r>
+    </w:p>
+    <w:p>
+      <w:pPr>
+        <w:pStyle w:val="Heading3"/>
+        <w:spacing w:before="200" w:after="80"/>
+      </w:pPr>
+      <w:r>
+        <w:rPr>
+          <w:rFonts w:ascii="Arial" w:hAnsi="Arial"/>
+          <w:color w:val="1B2A4A"/>
+        </w:rPr>
+        <w:t>Purpose</w:t>
+      </w:r>
+    </w:p>
+    <w:p>
+      <w:pPr>
+        <w:spacing w:line="276" w:lineRule="auto" w:before="40" w:after="120"/>
+        <w:jc w:val="both"/>
+      </w:pPr>
+      <w:r>
+        <w:rPr>
+          <w:rFonts w:ascii="Arial" w:hAnsi="Arial"/>
+          <w:b w:val="0"/>
+          <w:i w:val="0"/>
+          <w:color w:val="3C3C3C"/>
+          <w:sz w:val="22"/>
+        </w:rPr>
+        <w:t xml:space="preserve">Unlike the backtest (which tells us what </w:t>
+      </w:r>
+      <w:r>
+        <w:rPr>
+          <w:rFonts w:ascii="Arial" w:hAnsi="Arial"/>
+          <w:b w:val="0"/>
           <w:i/>
           <w:color w:val="3C3C3C"/>
-          <w:sz w:val="16"/>
+          <w:sz w:val="22"/>
         </w:rPr>
-        <w:t>Source: FRED OAS data  |  Figure 11: Monte Carlo Fan Chart — 5,000 Simulations, 24mo Horizon</w:t>
+        <w:t>did</w:t>
+      </w:r>
+      <w:r>
+        <w:rPr>
+          <w:rFonts w:ascii="Arial" w:hAnsi="Arial"/>
+          <w:b w:val="0"/>
+          <w:i w:val="0"/>
+          <w:color w:val="3C3C3C"/>
+          <w:sz w:val="22"/>
+        </w:rPr>
+        <w:t xml:space="preserve"> happen), Monte Carlo tells us what </w:t>
+      </w:r>
+      <w:r>
+        <w:rPr>
+          <w:rFonts w:ascii="Arial" w:hAnsi="Arial"/>
+          <w:b w:val="0"/>
+          <w:i/>
+          <w:color w:val="3C3C3C"/>
+          <w:sz w:val="22"/>
+        </w:rPr>
+        <w:t>could</w:t>
+      </w:r>
+      <w:r>
+        <w:rPr>
+          <w:rFonts w:ascii="Arial" w:hAnsi="Arial"/>
+          <w:b w:val="0"/>
+          <w:i w:val="0"/>
+          <w:color w:val="3C3C3C"/>
+          <w:sz w:val="22"/>
+        </w:rPr>
+        <w:t xml:space="preserve"> happen by resampling from the actual return distribution. This quantifies forward-looking risk.</w:t>
       </w:r>
     </w:p>
     <w:p>
       <w:pPr>
-        <w:spacing w:before="200" w:after="80" w:line="264" w:lineRule="auto"/>
+        <w:pStyle w:val="Heading3"/>
+        <w:spacing w:before="200" w:after="80"/>
+      </w:pPr>
+      <w:r>
+        <w:rPr>
+          <w:rFonts w:ascii="Arial" w:hAnsi="Arial"/>
+          <w:color w:val="1B2A4A"/>
+        </w:rPr>
+        <w:t>Methodology</w:t>
+      </w:r>
+    </w:p>
+    <w:p>
+      <w:pPr>
+        <w:spacing w:line="276" w:lineRule="auto" w:before="40" w:after="120"/>
+        <w:jc w:val="both"/>
+      </w:pPr>
+      <w:r>
+        <w:rPr>
+          <w:rFonts w:ascii="Arial" w:hAnsi="Arial"/>
+          <w:b w:val="0"/>
+          <w:i w:val="0"/>
+          <w:color w:val="3C3C3C"/>
+          <w:sz w:val="22"/>
+        </w:rPr>
+        <w:t xml:space="preserve">We use </w:t>
+      </w:r>
+      <w:r>
+        <w:rPr>
+          <w:rFonts w:ascii="Arial" w:hAnsi="Arial"/>
+          <w:b/>
+          <w:i w:val="0"/>
+          <w:color w:val="3C3C3C"/>
+          <w:sz w:val="22"/>
+        </w:rPr>
+        <w:t>empirical bootstrap resampling</w:t>
+      </w:r>
+      <w:r>
+        <w:rPr>
+          <w:rFonts w:ascii="Arial" w:hAnsi="Arial"/>
+          <w:b w:val="0"/>
+          <w:i w:val="0"/>
+          <w:color w:val="3C3C3C"/>
+          <w:sz w:val="22"/>
+        </w:rPr>
+        <w:t>: sample monthly returns with replacement from the actual backtest history (5,000 simulations, 24-month horizon). This preserves the real return distribution including skewness and fat tails --- unlike parametric simulation, which assumes normality and underestimates tail risk.</w:t>
+      </w:r>
+    </w:p>
+    <w:p>
+      <w:pPr>
+        <w:pStyle w:val="Heading3"/>
+        <w:spacing w:before="200" w:after="80"/>
+      </w:pPr>
+      <w:r>
+        <w:rPr>
+          <w:rFonts w:ascii="Arial" w:hAnsi="Arial"/>
+          <w:color w:val="1B2A4A"/>
+        </w:rPr>
+        <w:t>Key Risk Metrics</w:t>
+      </w:r>
+    </w:p>
+    <w:tbl>
+      <w:tblPr>
+        <w:tblStyle w:val="TableGrid"/>
+        <w:tblW w:type="auto" w:w="0"/>
+        <w:jc w:val="center"/>
+        <w:tblLook w:firstColumn="1" w:firstRow="1" w:lastColumn="0" w:lastRow="0" w:noHBand="0" w:noVBand="1" w:val="04A0"/>
+        <w:tblBorders>
+          <w:top w:val="single" w:sz="4" w:space="0" w:color="1B2A4A"/>
+          <w:bottom w:val="single" w:sz="4" w:space="0" w:color="1B2A4A"/>
+          <w:insideH w:val="single" w:sz="2" w:space="0" w:color="CCCCCC"/>
+        </w:tblBorders>
+      </w:tblPr>
+      <w:tblGrid>
+        <w:gridCol w:w="3120"/>
+        <w:gridCol w:w="3120"/>
+        <w:gridCol w:w="3120"/>
+      </w:tblGrid>
+      <w:tr>
+        <w:tc>
+          <w:tcPr>
+            <w:tcW w:type="dxa" w:w="3120"/>
+            <w:shd w:fill="1B2A4A" w:val="clear"/>
+          </w:tcPr>
+          <w:p>
+            <w:r>
+              <w:rPr>
+                <w:rFonts w:ascii="Arial" w:hAnsi="Arial"/>
+                <w:b/>
+                <w:color w:val="FFFFFF"/>
+                <w:sz w:val="20"/>
+              </w:rPr>
+            </w:r>
+            <w:r>
+              <w:rPr>
+                <w:rFonts w:ascii="Arial" w:hAnsi="Arial"/>
+                <w:b/>
+                <w:color w:val="FFFFFF"/>
+                <w:sz w:val="20"/>
+              </w:rPr>
+              <w:t>Metric</w:t>
+            </w:r>
+          </w:p>
+        </w:tc>
+        <w:tc>
+          <w:tcPr>
+            <w:tcW w:type="dxa" w:w="3120"/>
+            <w:shd w:fill="1B2A4A" w:val="clear"/>
+          </w:tcPr>
+          <w:p>
+            <w:r>
+              <w:rPr>
+                <w:rFonts w:ascii="Arial" w:hAnsi="Arial"/>
+                <w:b/>
+                <w:color w:val="FFFFFF"/>
+                <w:sz w:val="20"/>
+              </w:rPr>
+            </w:r>
+            <w:r>
+              <w:rPr>
+                <w:rFonts w:ascii="Arial" w:hAnsi="Arial"/>
+                <w:b/>
+                <w:color w:val="FFFFFF"/>
+                <w:sz w:val="20"/>
+              </w:rPr>
+              <w:t>Definition</w:t>
+            </w:r>
+          </w:p>
+        </w:tc>
+        <w:tc>
+          <w:tcPr>
+            <w:tcW w:type="dxa" w:w="3120"/>
+            <w:shd w:fill="1B2A4A" w:val="clear"/>
+          </w:tcPr>
+          <w:p>
+            <w:r>
+              <w:rPr>
+                <w:rFonts w:ascii="Arial" w:hAnsi="Arial"/>
+                <w:b/>
+                <w:color w:val="FFFFFF"/>
+                <w:sz w:val="20"/>
+              </w:rPr>
+            </w:r>
+            <w:r>
+              <w:rPr>
+                <w:rFonts w:ascii="Arial" w:hAnsi="Arial"/>
+                <w:b/>
+                <w:color w:val="FFFFFF"/>
+                <w:sz w:val="20"/>
+              </w:rPr>
+              <w:t>Interpretation</w:t>
+            </w:r>
+          </w:p>
+        </w:tc>
+      </w:tr>
+      <w:tr>
+        <w:tc>
+          <w:tcPr>
+            <w:tcW w:type="dxa" w:w="3120"/>
+          </w:tcPr>
+          <w:p>
+            <w:r>
+              <w:rPr>
+                <w:rFonts w:ascii="Arial" w:hAnsi="Arial"/>
+                <w:color w:val="3C3C3C"/>
+                <w:sz w:val="20"/>
+              </w:rPr>
+            </w:r>
+            <w:r>
+              <w:rPr>
+                <w:rFonts w:ascii="Arial" w:hAnsi="Arial"/>
+                <w:color w:val="3C3C3C"/>
+                <w:sz w:val="20"/>
+              </w:rPr>
+              <w:t>VaR (Value at Risk)</w:t>
+            </w:r>
+          </w:p>
+        </w:tc>
+        <w:tc>
+          <w:tcPr>
+            <w:tcW w:type="dxa" w:w="3120"/>
+          </w:tcPr>
+          <w:p>
+            <w:r>
+              <w:rPr>
+                <w:rFonts w:ascii="Arial" w:hAnsi="Arial"/>
+                <w:color w:val="3C3C3C"/>
+                <w:sz w:val="20"/>
+              </w:rPr>
+            </w:r>
+            <w:r>
+              <w:rPr>
+                <w:rFonts w:ascii="Arial" w:hAnsi="Arial"/>
+                <w:color w:val="3C3C3C"/>
+                <w:sz w:val="20"/>
+              </w:rPr>
+              <w:t>Loss threshold at a given confidence level</w:t>
+            </w:r>
+          </w:p>
+        </w:tc>
+        <w:tc>
+          <w:tcPr>
+            <w:tcW w:type="dxa" w:w="3120"/>
+          </w:tcPr>
+          <w:p>
+            <w:r>
+              <w:rPr>
+                <w:rFonts w:ascii="Arial" w:hAnsi="Arial"/>
+                <w:color w:val="3C3C3C"/>
+                <w:sz w:val="20"/>
+              </w:rPr>
+            </w:r>
+            <w:r>
+              <w:rPr>
+                <w:rFonts w:ascii="Arial" w:hAnsi="Arial"/>
+                <w:color w:val="3C3C3C"/>
+                <w:sz w:val="20"/>
+              </w:rPr>
+              <w:t>"There is a 5% chance of losing more than X%"</w:t>
+            </w:r>
+          </w:p>
+        </w:tc>
+      </w:tr>
+      <w:tr>
+        <w:tc>
+          <w:tcPr>
+            <w:tcW w:type="dxa" w:w="3120"/>
+            <w:shd w:fill="F2F2F2" w:val="clear"/>
+          </w:tcPr>
+          <w:p>
+            <w:r>
+              <w:rPr>
+                <w:rFonts w:ascii="Arial" w:hAnsi="Arial"/>
+                <w:color w:val="3C3C3C"/>
+                <w:sz w:val="20"/>
+              </w:rPr>
+            </w:r>
+            <w:r>
+              <w:rPr>
+                <w:rFonts w:ascii="Arial" w:hAnsi="Arial"/>
+                <w:color w:val="3C3C3C"/>
+                <w:sz w:val="20"/>
+              </w:rPr>
+              <w:t>CVaR (Conditional VaR)</w:t>
+            </w:r>
+          </w:p>
+        </w:tc>
+        <w:tc>
+          <w:tcPr>
+            <w:tcW w:type="dxa" w:w="3120"/>
+            <w:shd w:fill="F2F2F2" w:val="clear"/>
+          </w:tcPr>
+          <w:p>
+            <w:r>
+              <w:rPr>
+                <w:rFonts w:ascii="Arial" w:hAnsi="Arial"/>
+                <w:color w:val="3C3C3C"/>
+                <w:sz w:val="20"/>
+              </w:rPr>
+            </w:r>
+            <w:r>
+              <w:rPr>
+                <w:rFonts w:ascii="Arial" w:hAnsi="Arial"/>
+                <w:color w:val="3C3C3C"/>
+                <w:sz w:val="20"/>
+              </w:rPr>
+              <w:t>Average loss when VaR is breached</w:t>
+            </w:r>
+          </w:p>
+        </w:tc>
+        <w:tc>
+          <w:tcPr>
+            <w:tcW w:type="dxa" w:w="3120"/>
+            <w:shd w:fill="F2F2F2" w:val="clear"/>
+          </w:tcPr>
+          <w:p>
+            <w:r>
+              <w:rPr>
+                <w:rFonts w:ascii="Arial" w:hAnsi="Arial"/>
+                <w:color w:val="3C3C3C"/>
+                <w:sz w:val="20"/>
+              </w:rPr>
+            </w:r>
+            <w:r>
+              <w:rPr>
+                <w:rFonts w:ascii="Arial" w:hAnsi="Arial"/>
+                <w:color w:val="3C3C3C"/>
+                <w:sz w:val="20"/>
+              </w:rPr>
+              <w:t>"When things go wrong, on average we lose Y%" --- captures tail severity</w:t>
+            </w:r>
+          </w:p>
+        </w:tc>
+      </w:tr>
+      <w:tr>
+        <w:tc>
+          <w:tcPr>
+            <w:tcW w:type="dxa" w:w="3120"/>
+          </w:tcPr>
+          <w:p>
+            <w:r>
+              <w:rPr>
+                <w:rFonts w:ascii="Arial" w:hAnsi="Arial"/>
+                <w:color w:val="3C3C3C"/>
+                <w:sz w:val="20"/>
+              </w:rPr>
+            </w:r>
+            <w:r>
+              <w:rPr>
+                <w:rFonts w:ascii="Arial" w:hAnsi="Arial"/>
+                <w:color w:val="3C3C3C"/>
+                <w:sz w:val="20"/>
+              </w:rPr>
+              <w:t>P(Loss)</w:t>
+            </w:r>
+          </w:p>
+        </w:tc>
+        <w:tc>
+          <w:tcPr>
+            <w:tcW w:type="dxa" w:w="3120"/>
+          </w:tcPr>
+          <w:p>
+            <w:r>
+              <w:rPr>
+                <w:rFonts w:ascii="Arial" w:hAnsi="Arial"/>
+                <w:color w:val="3C3C3C"/>
+                <w:sz w:val="20"/>
+              </w:rPr>
+            </w:r>
+            <w:r>
+              <w:rPr>
+                <w:rFonts w:ascii="Arial" w:hAnsi="Arial"/>
+                <w:color w:val="3C3C3C"/>
+                <w:sz w:val="20"/>
+              </w:rPr>
+              <w:t>Probability of negative cumulative return over horizon</w:t>
+            </w:r>
+          </w:p>
+        </w:tc>
+        <w:tc>
+          <w:tcPr>
+            <w:tcW w:type="dxa" w:w="3120"/>
+          </w:tcPr>
+          <w:p>
+            <w:r>
+              <w:rPr>
+                <w:rFonts w:ascii="Arial" w:hAnsi="Arial"/>
+                <w:color w:val="3C3C3C"/>
+                <w:sz w:val="20"/>
+              </w:rPr>
+            </w:r>
+            <w:r>
+              <w:rPr>
+                <w:rFonts w:ascii="Arial" w:hAnsi="Arial"/>
+                <w:color w:val="3C3C3C"/>
+                <w:sz w:val="20"/>
+              </w:rPr>
+              <w:t>"Probability of negative terminal return"</w:t>
+            </w:r>
+          </w:p>
+        </w:tc>
+      </w:tr>
+    </w:tbl>
+    <w:p>
+      <w:pPr>
+        <w:spacing w:before="40" w:after="80"/>
+      </w:pPr>
+    </w:p>
+    <w:p>
+      <w:pPr>
+        <w:spacing w:line="276" w:lineRule="auto" w:before="40" w:after="120"/>
+        <w:jc w:val="both"/>
+      </w:pPr>
+      <w:r>
+        <w:rPr>
+          <w:rFonts w:ascii="Arial" w:hAnsi="Arial"/>
+          <w:b w:val="0"/>
+          <w:i w:val="0"/>
+          <w:color w:val="3C3C3C"/>
+          <w:sz w:val="22"/>
+        </w:rPr>
+        <w:t>The fan chart below shows the distribution of simulated cumulative return paths. The dark band is the interquartile range (25th--75th percentile); the light band is the 5th--95th percentile. The median path represents the central tendency under historical return dynamics.</w:t>
+      </w:r>
+    </w:p>
+    <w:p>
+      <w:pPr>
+        <w:spacing w:before="240" w:after="60" w:line="264" w:lineRule="auto"/>
       </w:pPr>
       <w:r>
         <w:rPr>
@@ -16817,12 +16559,12 @@
           <w:color w:val="1B2A4A"/>
           <w:sz w:val="20"/>
         </w:rPr>
-        <w:t>Terminal return distribution is right-skewed with limited left-tail exposure</w:t>
+        <w:t>Monte Carlo simulations show positive expected return with bounded downside over 24 months</w:t>
       </w:r>
     </w:p>
     <w:p>
       <w:pPr>
-        <w:spacing w:before="40"/>
+        <w:spacing w:before="40" w:after="200"/>
         <w:jc w:val="center"/>
       </w:pPr>
       <w:r>
@@ -16837,7 +16579,7 @@
               <a:graphicData uri="http://schemas.openxmlformats.org/drawingml/2006/picture">
                 <pic:pic>
                   <pic:nvPicPr>
-                    <pic:cNvPr id="0" name="fig_4400347264.png"/>
+                    <pic:cNvPr id="0" name="fig_4437121280.png"/>
                     <pic:cNvPicPr/>
                   </pic:nvPicPr>
                   <pic:blipFill>
@@ -16862,17 +16604,56 @@
     </w:p>
     <w:p>
       <w:pPr>
-        <w:spacing w:before="40" w:after="160"/>
-        <w:jc w:val="left"/>
+        <w:spacing w:before="240" w:after="60" w:line="264" w:lineRule="auto"/>
       </w:pPr>
       <w:r>
         <w:rPr>
           <w:rFonts w:ascii="Arial" w:hAnsi="Arial"/>
-          <w:i/>
-          <w:color w:val="3C3C3C"/>
-          <w:sz w:val="16"/>
+          <w:b/>
+          <w:color w:val="1B2A4A"/>
+          <w:sz w:val="20"/>
         </w:rPr>
-        <w:t>Source: FRED OAS data  |  Figure 12: Terminal Return Distribution (24mo)</w:t>
+        <w:t>Terminal return distribution is right-skewed with limited left-tail exposure</w:t>
+      </w:r>
+    </w:p>
+    <w:p>
+      <w:pPr>
+        <w:spacing w:before="40" w:after="200"/>
+        <w:jc w:val="center"/>
+      </w:pPr>
+      <w:r>
+        <w:drawing>
+          <wp:inline xmlns:a="http://schemas.openxmlformats.org/drawingml/2006/main" xmlns:pic="http://schemas.openxmlformats.org/drawingml/2006/picture">
+            <wp:extent cx="5943600" cy="3632200"/>
+            <wp:docPr id="17" name="Picture 17"/>
+            <wp:cNvGraphicFramePr>
+              <a:graphicFrameLocks noChangeAspect="1"/>
+            </wp:cNvGraphicFramePr>
+            <a:graphic>
+              <a:graphicData uri="http://schemas.openxmlformats.org/drawingml/2006/picture">
+                <pic:pic>
+                  <pic:nvPicPr>
+                    <pic:cNvPr id="0" name="fig_4437172672.png"/>
+                    <pic:cNvPicPr/>
+                  </pic:nvPicPr>
+                  <pic:blipFill>
+                    <a:blip r:embed="rId22"/>
+                    <a:stretch>
+                      <a:fillRect/>
+                    </a:stretch>
+                  </pic:blipFill>
+                  <pic:spPr>
+                    <a:xfrm>
+                      <a:off x="0" y="0"/>
+                      <a:ext cx="5943600" cy="3632200"/>
+                    </a:xfrm>
+                    <a:prstGeom prst="rect"/>
+                  </pic:spPr>
+                </pic:pic>
+              </a:graphicData>
+            </a:graphic>
+          </wp:inline>
+        </w:drawing>
       </w:r>
     </w:p>
     <w:tbl>
@@ -17367,12 +17148,13 @@
     </w:p>
     <w:p>
       <w:pPr>
-        <w:spacing w:before="360" w:after="0"/>
+        <w:spacing w:before="400" w:after="0"/>
       </w:pPr>
     </w:p>
     <w:p>
       <w:pPr>
         <w:pStyle w:val="Heading1"/>
+        <w:spacing w:before="0" w:after="160"/>
       </w:pPr>
       <w:r>
         <w:rPr>
@@ -17385,6 +17167,7 @@
     <w:p>
       <w:pPr>
         <w:pStyle w:val="Heading2"/>
+        <w:spacing w:before="280" w:after="120"/>
       </w:pPr>
       <w:r>
         <w:rPr>
@@ -17396,7 +17179,7 @@
     </w:p>
     <w:p>
       <w:pPr>
-        <w:spacing w:line="276" w:lineRule="auto" w:after="120"/>
+        <w:spacing w:line="276" w:lineRule="auto" w:before="40" w:after="120"/>
         <w:jc w:val="both"/>
       </w:pPr>
       <w:r>
@@ -17442,7 +17225,7 @@
     </w:p>
     <w:p>
       <w:pPr>
-        <w:spacing w:line="276" w:lineRule="auto" w:after="120"/>
+        <w:spacing w:line="276" w:lineRule="auto" w:before="40" w:after="120"/>
         <w:jc w:val="both"/>
       </w:pPr>
       <w:r>
@@ -17459,6 +17242,7 @@
     <w:p>
       <w:pPr>
         <w:pStyle w:val="Heading2"/>
+        <w:spacing w:before="280" w:after="120"/>
       </w:pPr>
       <w:r>
         <w:rPr>
@@ -17471,7 +17255,7 @@
     <w:p>
       <w:pPr>
         <w:pStyle w:val="ListNumber"/>
-        <w:spacing w:line="276" w:lineRule="auto"/>
+        <w:spacing w:line="276" w:lineRule="auto" w:after="60"/>
       </w:pPr>
       <w:r>
         <w:rPr>
@@ -17497,7 +17281,7 @@
     <w:p>
       <w:pPr>
         <w:pStyle w:val="ListNumber"/>
-        <w:spacing w:line="276" w:lineRule="auto"/>
+        <w:spacing w:line="276" w:lineRule="auto" w:after="60"/>
       </w:pPr>
       <w:r>
         <w:rPr>
@@ -17523,7 +17307,7 @@
     <w:p>
       <w:pPr>
         <w:pStyle w:val="ListNumber"/>
-        <w:spacing w:line="276" w:lineRule="auto"/>
+        <w:spacing w:line="276" w:lineRule="auto" w:after="60"/>
       </w:pPr>
       <w:r>
         <w:rPr>
@@ -17549,7 +17333,7 @@
     <w:p>
       <w:pPr>
         <w:pStyle w:val="ListNumber"/>
-        <w:spacing w:line="276" w:lineRule="auto"/>
+        <w:spacing w:line="276" w:lineRule="auto" w:after="60"/>
       </w:pPr>
       <w:r>
         <w:rPr>
@@ -17575,6 +17359,7 @@
     <w:p>
       <w:pPr>
         <w:pStyle w:val="Heading2"/>
+        <w:spacing w:before="280" w:after="120"/>
       </w:pPr>
       <w:r>
         <w:rPr>
@@ -17587,7 +17372,7 @@
     <w:p>
       <w:pPr>
         <w:pStyle w:val="ListNumber"/>
-        <w:spacing w:line="276" w:lineRule="auto"/>
+        <w:spacing w:line="276" w:lineRule="auto" w:after="60"/>
       </w:pPr>
       <w:r>
         <w:rPr>
@@ -17613,7 +17398,7 @@
     <w:p>
       <w:pPr>
         <w:pStyle w:val="ListNumber"/>
-        <w:spacing w:line="276" w:lineRule="auto"/>
+        <w:spacing w:line="276" w:lineRule="auto" w:after="60"/>
       </w:pPr>
       <w:r>
         <w:rPr>
@@ -17639,7 +17424,7 @@
     <w:p>
       <w:pPr>
         <w:pStyle w:val="ListNumber"/>
-        <w:spacing w:line="276" w:lineRule="auto"/>
+        <w:spacing w:line="276" w:lineRule="auto" w:after="60"/>
       </w:pPr>
       <w:r>
         <w:rPr>
@@ -17665,7 +17450,7 @@
     <w:p>
       <w:pPr>
         <w:pStyle w:val="ListNumber"/>
-        <w:spacing w:line="276" w:lineRule="auto"/>
+        <w:spacing w:line="276" w:lineRule="auto" w:after="60"/>
       </w:pPr>
       <w:r>
         <w:rPr>
@@ -17691,6 +17476,7 @@
     <w:p>
       <w:pPr>
         <w:pStyle w:val="Heading2"/>
+        <w:spacing w:before="280" w:after="120"/>
       </w:pPr>
       <w:r>
         <w:rPr>
@@ -18214,12 +18000,13 @@
     </w:tbl>
     <w:p>
       <w:pPr>
-        <w:spacing w:before="80" w:after="80"/>
+        <w:spacing w:before="40" w:after="80"/>
       </w:pPr>
     </w:p>
     <w:p>
       <w:pPr>
         <w:pStyle w:val="Heading2"/>
+        <w:spacing w:before="280" w:after="120"/>
       </w:pPr>
       <w:r>
         <w:rPr>
@@ -18232,7 +18019,7 @@
     <w:p>
       <w:pPr>
         <w:pStyle w:val="ListNumber"/>
-        <w:spacing w:line="276" w:lineRule="auto"/>
+        <w:spacing w:line="276" w:lineRule="auto" w:after="60"/>
       </w:pPr>
       <w:r>
         <w:rPr>
@@ -18258,7 +18045,7 @@
     <w:p>
       <w:pPr>
         <w:pStyle w:val="ListNumber"/>
-        <w:spacing w:line="276" w:lineRule="auto"/>
+        <w:spacing w:line="276" w:lineRule="auto" w:after="60"/>
       </w:pPr>
       <w:r>
         <w:rPr>
@@ -18284,7 +18071,7 @@
     <w:p>
       <w:pPr>
         <w:pStyle w:val="ListNumber"/>
-        <w:spacing w:line="276" w:lineRule="auto"/>
+        <w:spacing w:line="276" w:lineRule="auto" w:after="60"/>
       </w:pPr>
       <w:r>
         <w:rPr>
@@ -18310,7 +18097,7 @@
     <w:p>
       <w:pPr>
         <w:pStyle w:val="ListNumber"/>
-        <w:spacing w:line="276" w:lineRule="auto"/>
+        <w:spacing w:line="276" w:lineRule="auto" w:after="60"/>
       </w:pPr>
       <w:r>
         <w:rPr>
@@ -18336,7 +18123,7 @@
     <w:p>
       <w:pPr>
         <w:pStyle w:val="ListNumber"/>
-        <w:spacing w:line="276" w:lineRule="auto"/>
+        <w:spacing w:line="276" w:lineRule="auto" w:after="60"/>
       </w:pPr>
       <w:r>
         <w:rPr>
@@ -18362,7 +18149,7 @@
     <w:p>
       <w:pPr>
         <w:pStyle w:val="ListNumber"/>
-        <w:spacing w:line="276" w:lineRule="auto"/>
+        <w:spacing w:line="276" w:lineRule="auto" w:after="60"/>
       </w:pPr>
       <w:r>
         <w:rPr>
@@ -18387,12 +18174,13 @@
     </w:p>
     <w:p>
       <w:pPr>
-        <w:spacing w:before="360" w:after="0"/>
+        <w:spacing w:before="400" w:after="0"/>
       </w:pPr>
     </w:p>
     <w:p>
       <w:pPr>
         <w:pStyle w:val="Heading1"/>
+        <w:spacing w:before="0" w:after="160"/>
       </w:pPr>
       <w:r>
         <w:rPr>
@@ -18404,7 +18192,7 @@
     </w:p>
     <w:p>
       <w:pPr>
-        <w:spacing w:line="276" w:lineRule="auto" w:after="120"/>
+        <w:spacing w:line="276" w:lineRule="auto" w:before="40" w:after="120"/>
         <w:jc w:val="both"/>
       </w:pPr>
       <w:r>
@@ -18440,7 +18228,7 @@
     </w:p>
     <w:p>
       <w:pPr>
-        <w:spacing w:line="276" w:lineRule="auto" w:after="120"/>
+        <w:spacing w:line="276" w:lineRule="auto" w:before="40" w:after="120"/>
         <w:jc w:val="both"/>
       </w:pPr>
       <w:r>
@@ -18476,7 +18264,7 @@
     </w:p>
     <w:p>
       <w:pPr>
-        <w:spacing w:line="276" w:lineRule="auto" w:after="120"/>
+        <w:spacing w:line="276" w:lineRule="auto" w:before="40" w:after="120"/>
         <w:jc w:val="both"/>
       </w:pPr>
       <w:r>
@@ -18512,7 +18300,7 @@
     </w:p>
     <w:p>
       <w:pPr>
-        <w:spacing w:line="276" w:lineRule="auto" w:after="120"/>
+        <w:spacing w:line="276" w:lineRule="auto" w:before="40" w:after="120"/>
         <w:jc w:val="both"/>
       </w:pPr>
       <w:r>
@@ -18548,7 +18336,7 @@
     </w:p>
     <w:p>
       <w:pPr>
-        <w:spacing w:line="276" w:lineRule="auto" w:after="120"/>
+        <w:spacing w:line="276" w:lineRule="auto" w:before="40" w:after="120"/>
         <w:jc w:val="both"/>
       </w:pPr>
       <w:r>
@@ -18584,7 +18372,7 @@
     </w:p>
     <w:p>
       <w:pPr>
-        <w:spacing w:line="276" w:lineRule="auto" w:after="120"/>
+        <w:spacing w:line="276" w:lineRule="auto" w:before="40" w:after="120"/>
         <w:jc w:val="both"/>
       </w:pPr>
       <w:r>
@@ -18620,7 +18408,7 @@
     </w:p>
     <w:p>
       <w:pPr>
-        <w:spacing w:line="276" w:lineRule="auto" w:after="120"/>
+        <w:spacing w:line="276" w:lineRule="auto" w:before="40" w:after="120"/>
         <w:jc w:val="both"/>
       </w:pPr>
       <w:r>
@@ -18656,7 +18444,7 @@
     </w:p>
     <w:p>
       <w:pPr>
-        <w:spacing w:line="276" w:lineRule="auto" w:after="120"/>
+        <w:spacing w:line="276" w:lineRule="auto" w:before="40" w:after="120"/>
         <w:jc w:val="both"/>
       </w:pPr>
       <w:r>
@@ -18692,7 +18480,7 @@
     </w:p>
     <w:p>
       <w:pPr>
-        <w:spacing w:line="276" w:lineRule="auto" w:after="120"/>
+        <w:spacing w:line="276" w:lineRule="auto" w:before="40" w:after="120"/>
         <w:jc w:val="both"/>
       </w:pPr>
       <w:r>
@@ -18728,7 +18516,7 @@
     </w:p>
     <w:p>
       <w:pPr>
-        <w:spacing w:line="276" w:lineRule="auto" w:after="120"/>
+        <w:spacing w:line="276" w:lineRule="auto" w:before="40" w:after="120"/>
         <w:jc w:val="both"/>
       </w:pPr>
       <w:r>
@@ -18764,7 +18552,7 @@
     </w:p>
     <w:p>
       <w:pPr>
-        <w:spacing w:line="276" w:lineRule="auto" w:after="120"/>
+        <w:spacing w:line="276" w:lineRule="auto" w:before="40" w:after="120"/>
         <w:jc w:val="both"/>
       </w:pPr>
       <w:r>
@@ -18800,7 +18588,7 @@
     </w:p>
     <w:p>
       <w:pPr>
-        <w:spacing w:line="276" w:lineRule="auto" w:after="120"/>
+        <w:spacing w:line="276" w:lineRule="auto" w:before="40" w:after="120"/>
         <w:jc w:val="both"/>
       </w:pPr>
       <w:r>
@@ -18814,8 +18602,53 @@
         <w:t>Correspondence: Michael Tabet, CFA</w:t>
       </w:r>
     </w:p>
+    <w:p>
+      <w:r>
+        <w:br w:type="page"/>
+      </w:r>
+    </w:p>
+    <w:p>
+      <w:pPr>
+        <w:spacing w:before="0" w:after="0"/>
+        <w:jc w:val="center"/>
+      </w:pPr>
+      <w:r>
+        <w:drawing>
+          <wp:inline xmlns:a="http://schemas.openxmlformats.org/drawingml/2006/main" xmlns:pic="http://schemas.openxmlformats.org/drawingml/2006/picture">
+            <wp:extent cx="6858000" cy="8875059"/>
+            <wp:docPr id="18" name="Picture 18"/>
+            <wp:cNvGraphicFramePr>
+              <a:graphicFrameLocks noChangeAspect="1"/>
+            </wp:cNvGraphicFramePr>
+            <a:graphic>
+              <a:graphicData uri="http://schemas.openxmlformats.org/drawingml/2006/picture">
+                <pic:pic>
+                  <pic:nvPicPr>
+                    <pic:cNvPr id="0" name="back_page.png"/>
+                    <pic:cNvPicPr/>
+                  </pic:nvPicPr>
+                  <pic:blipFill>
+                    <a:blip r:embed="rId23"/>
+                    <a:stretch>
+                      <a:fillRect/>
+                    </a:stretch>
+                  </pic:blipFill>
+                  <pic:spPr>
+                    <a:xfrm>
+                      <a:off x="0" y="0"/>
+                      <a:ext cx="6858000" cy="8875059"/>
+                    </a:xfrm>
+                    <a:prstGeom prst="rect"/>
+                  </pic:spPr>
+                </pic:pic>
+              </a:graphicData>
+            </a:graphic>
+          </wp:inline>
+        </w:drawing>
+      </w:r>
+    </w:p>
     <w:sectPr>
-      <w:footerReference w:type="default" r:id="rId22"/>
+      <w:footerReference w:type="default" r:id="rId24"/>
       <w:pgSz w:w="12240" w:h="15840"/>
       <w:pgMar w:top="1440" w:right="1440" w:bottom="1440" w:left="1440" w:header="720" w:footer="720" w:gutter="0"/>
       <w:cols w:space="720"/>
@@ -19284,7 +19117,7 @@
     <w:pPr>
       <w:keepNext/>
       <w:keepLines/>
-      <w:spacing w:before="480" w:after="0"/>
+      <w:spacing w:before="400" w:after="160"/>
       <w:outlineLvl w:val="0"/>
     </w:pPr>
     <w:rPr>
@@ -19308,7 +19141,7 @@
     <w:pPr>
       <w:keepNext/>
       <w:keepLines/>
-      <w:spacing w:before="200" w:after="0"/>
+      <w:spacing w:before="280" w:after="120"/>
       <w:outlineLvl w:val="1"/>
     </w:pPr>
     <w:rPr>
@@ -19316,7 +19149,7 @@
       <w:b/>
       <w:bCs/>
       <w:color w:val="3D5A80"/>
-      <w:sz w:val="30"/>
+      <w:sz w:val="28"/>
       <w:szCs w:val="26"/>
     </w:rPr>
   </w:style>
@@ -19332,7 +19165,7 @@
     <w:pPr>
       <w:keepNext/>
       <w:keepLines/>
-      <w:spacing w:before="200" w:after="0"/>
+      <w:spacing w:before="200" w:after="80"/>
       <w:outlineLvl w:val="2"/>
     </w:pPr>
     <w:rPr>
@@ -19340,7 +19173,7 @@
       <w:b/>
       <w:bCs/>
       <w:color w:val="1B2A4A"/>
-      <w:sz w:val="26"/>
+      <w:sz w:val="24"/>
     </w:rPr>
   </w:style>
   <w:style w:type="paragraph" w:styleId="Heading4">

</xml_diff>